<commit_message>
Explain how measured current is used as a loss function in layman terms
</commit_message>
<xml_diff>
--- a/PINN_Approach_Layman.docx
+++ b/PINN_Approach_Layman.docx
@@ -91,7 +91,7 @@
         <w:t xml:space="preserve">Justification: </w:t>
       </w:r>
       <w:r>
-        <w:t>Instead of feeding the entire noisy electrical signal into the AI and asking it to fix it, we flip the problem upside down. We give the AI a specific timestamp, and ask it to guess what the current should be based on its physics training. If its guess is wrong compared to your actual sensor data, it corrects itself. By only using "Time" as the input, the AI acts as a mathematical function generator, forcing it to figure out the smoothest, most physically realistic timeline of events.</w:t>
+        <w:t>Instead of feeding the entire noisy electrical signal into the AI and asking it to fix it, we flip the problem upside down. We give the AI a specific timestamp, and ask it to guess what the current should be based on its physics training. By only using "Time" as the input, the AI acts as a mathematical function generator, forcing it to figure out the smoothest, most physically realistic timeline of events from scratch.</w:t>
       </w:r>
     </w:p>
     <w:p>
@@ -99,7 +99,37 @@
         <w:pStyle w:val="Heading1"/>
       </w:pPr>
       <w:r>
-        <w:t>4. The Output</w:t>
+        <w:t>4. The Grader: Where the Actual Current is Used</w:t>
+      </w:r>
+    </w:p>
+    <w:p>
+      <w:r>
+        <w:rPr>
+          <w:b/>
+        </w:rPr>
+        <w:t xml:space="preserve">Feature Used: </w:t>
+      </w:r>
+      <w:r>
+        <w:t>The actual measured current from your Excel sensor data is used exclusively in the "Loss Function" (the AI's grading rubric). It is NEVER used as an input.</w:t>
+      </w:r>
+    </w:p>
+    <w:p>
+      <w:r>
+        <w:rPr>
+          <w:b/>
+        </w:rPr>
+        <w:t xml:space="preserve">Justification: </w:t>
+      </w:r>
+      <w:r>
+        <w:t>If we fed the messy, noisy sensor current directly into the AI as an input, the AI would just memorize the noise and hand it right back to us. Instead, the AI takes its guess (based purely on Time), walks over to your Excel file, and checks the answer key. If the AI guesses the current is 8.5 Amps, but the Excel file says it was actually 9.2 Amps, the AI realizes it was off by 0.7 Amps. It takes that error, tweaks its internal math, and tries again. By using the actual current only as an "answer key" to grade the AI, we force the AI to organically untangle the smooth motor physics from the jagged brush hits without cheating by looking at the noise directly.</w:t>
+      </w:r>
+    </w:p>
+    <w:p>
+      <w:pPr>
+        <w:pStyle w:val="Heading1"/>
+      </w:pPr>
+      <w:r>
+        <w:t>5. The Output</w:t>
       </w:r>
     </w:p>
     <w:p>
@@ -125,7 +155,7 @@
         <w:t xml:space="preserve">Justification: </w:t>
       </w:r>
       <w:r>
-        <w:t>By designing the AI to have two separate outputs, we force it to literally untangle the signal for us. The AI is penalized if the "Baseline" output doesn't obey the smooth laws of physics. Because the Baseline is forced to be smooth, the AI has no choice but to dump all the tiny, jagged commutation waves into the "Ripple" output to make the math balance out. Once the AI finishes running, we can completely throw away the Baseline output and just run a simple peak-counter on the perfectly isolated Ripple output to get our final count.</w:t>
+        <w:t>By designing the AI to have two separate outputs, we force it to literally untangle the signal for us. The AI is penalized if the "Baseline" output doesn't obey the smooth laws of physics. Because the Baseline is forced to be smooth, the AI has no choice but to dump all the tiny, jagged commutation waves into the "Ripple" output to make its final guess match the answer key. Once the AI finishes running, we can completely throw away the Baseline output and just run a simple peak-counter on the perfectly isolated Ripple output to get our final count.</w:t>
       </w:r>
     </w:p>
     <w:sectPr>

</xml_diff>

<commit_message>
Explain how missing Voltage data is handled in layman terms
</commit_message>
<xml_diff>
--- a/PINN_Approach_Layman.docx
+++ b/PINN_Approach_Layman.docx
@@ -129,7 +129,37 @@
         <w:pStyle w:val="Heading1"/>
       </w:pPr>
       <w:r>
-        <w:t>5. The Output</w:t>
+        <w:t>5. The Missing Piece: What about Voltage (V)?</w:t>
+      </w:r>
+    </w:p>
+    <w:p>
+      <w:r>
+        <w:rPr>
+          <w:b/>
+        </w:rPr>
+        <w:t xml:space="preserve">Feature Used: </w:t>
+      </w:r>
+      <w:r>
+        <w:t>The electrical Voltage (V) driving the motor is treated as a "Constant Assumption" or a "Learnable Rule" within the physics math, rather than a changing sensor input.</w:t>
+      </w:r>
+    </w:p>
+    <w:p>
+      <w:r>
+        <w:rPr>
+          <w:b/>
+        </w:rPr>
+        <w:t xml:space="preserve">Justification: </w:t>
+      </w:r>
+      <w:r>
+        <w:t>The basic laws of physics dictate that the current flowing through a motor is driven by the Voltage. However, your Excel sensor data only recorded the Current, not the Voltage. To solve this, we don't feed Voltage as a changing input. Instead, we either tell the AI, "Assume the battery is providing a constant 12 Volts while the motor is on," or we allow the AI to guess the average Voltage just like it guesses the motor's other internal properties (like resistance). Because the Voltage is just a steady driving force while the motor is on, this assumption is more than enough for the AI to balance its physics equations and successfully extract the ripples.</w:t>
+      </w:r>
+    </w:p>
+    <w:p>
+      <w:pPr>
+        <w:pStyle w:val="Heading1"/>
+      </w:pPr>
+      <w:r>
+        <w:t>6. The Output</w:t>
       </w:r>
     </w:p>
     <w:p>

</xml_diff>

<commit_message>
Update docs to reflect that Voltage is used as an input alongside Time
</commit_message>
<xml_diff>
--- a/PINN_Approach_Layman.docx
+++ b/PINN_Approach_Layman.docx
@@ -69,7 +69,7 @@
         <w:pStyle w:val="Heading1"/>
       </w:pPr>
       <w:r>
-        <w:t>3. The Input</w:t>
+        <w:t>3. The Inputs (Time and Voltage)</w:t>
       </w:r>
     </w:p>
     <w:p>
@@ -77,10 +77,14 @@
         <w:rPr>
           <w:b/>
         </w:rPr>
-        <w:t xml:space="preserve">Input Feature: </w:t>
+        <w:t xml:space="preserve">Input Features: </w:t>
       </w:r>
       <w:r>
-        <w:t>The only input fed into the AI is Time (for example, "What is happening at exactly 2.53 seconds?").</w:t>
+        <w:t>The AI is fed exactly two things:</w:t>
+        <w:br/>
+        <w:t>1. Time (for example, "What is happening at exactly 2.53 seconds?").</w:t>
+        <w:br/>
+        <w:t>2. Measured Voltage (the actual voltage sensor reading at that exact microsecond).</w:t>
       </w:r>
     </w:p>
     <w:p>
@@ -91,7 +95,7 @@
         <w:t xml:space="preserve">Justification: </w:t>
       </w:r>
       <w:r>
-        <w:t>Instead of feeding the entire noisy electrical signal into the AI and asking it to fix it, we flip the problem upside down. We give the AI a specific timestamp, and ask it to guess what the current should be based on its physics training. By only using "Time" as the input, the AI acts as a mathematical function generator, forcing it to figure out the smoothest, most physically realistic timeline of events from scratch.</w:t>
+        <w:t>To use the laws of physics, the AI must know the "pushing force" (Voltage) driving the motor at any given moment. By feeding the AI the Time and the true Voltage, the AI acts as a mathematical function generator. It uses the true Voltage to perfectly calculate what the smoothest, most physically realistic Baseline Current *should* be, rather than trying to blindly fix a noisy signal.</w:t>
       </w:r>
     </w:p>
     <w:p>
@@ -110,7 +114,7 @@
         <w:t xml:space="preserve">Feature Used: </w:t>
       </w:r>
       <w:r>
-        <w:t>The actual measured current from your Excel sensor data is used exclusively in the "Loss Function" (the AI's grading rubric). It is NEVER used as an input.</w:t>
+        <w:t>The actual measured Current from your Excel sensor data is used exclusively in the "Loss Function" (the AI's grading rubric). It is NEVER used as an input.</w:t>
       </w:r>
     </w:p>
     <w:p>
@@ -121,7 +125,7 @@
         <w:t xml:space="preserve">Justification: </w:t>
       </w:r>
       <w:r>
-        <w:t>If we fed the messy, noisy sensor current directly into the AI as an input, the AI would just memorize the noise and hand it right back to us. Instead, the AI takes its guess (based purely on Time), walks over to your Excel file, and checks the answer key. If the AI guesses the current is 8.5 Amps, but the Excel file says it was actually 9.2 Amps, the AI realizes it was off by 0.7 Amps. It takes that error, tweaks its internal math, and tries again. By using the actual current only as an "answer key" to grade the AI, we force the AI to organically untangle the smooth motor physics from the jagged brush hits without cheating by looking at the noise directly.</w:t>
+        <w:t>If we fed the messy, noisy sensor Current directly into the AI as an input, the AI would just memorize the noise and hand it right back to us. Instead, the AI takes its guess (based purely on the Time and the Voltage), walks over to your Excel file, and checks the answer key. If the AI guesses the current is 8.5 Amps, but the Excel file says it was actually 9.2 Amps, the AI realizes it was off by 0.7 Amps. It takes that error, tweaks its internal math, and tries again. By using the actual Current only as an "answer key" to grade the AI, we force the AI to organically untangle the smooth motor physics from the jagged brush hits without cheating by looking at the noise directly.</w:t>
       </w:r>
     </w:p>
     <w:p>
@@ -129,37 +133,7 @@
         <w:pStyle w:val="Heading1"/>
       </w:pPr>
       <w:r>
-        <w:t>5. The Missing Piece: What about Voltage (V)?</w:t>
-      </w:r>
-    </w:p>
-    <w:p>
-      <w:r>
-        <w:rPr>
-          <w:b/>
-        </w:rPr>
-        <w:t xml:space="preserve">Feature Used: </w:t>
-      </w:r>
-      <w:r>
-        <w:t>The electrical Voltage (V) driving the motor is treated as a "Constant Assumption" or a "Learnable Rule" within the physics math, rather than a changing sensor input.</w:t>
-      </w:r>
-    </w:p>
-    <w:p>
-      <w:r>
-        <w:rPr>
-          <w:b/>
-        </w:rPr>
-        <w:t xml:space="preserve">Justification: </w:t>
-      </w:r>
-      <w:r>
-        <w:t>The basic laws of physics dictate that the current flowing through a motor is driven by the Voltage. However, your Excel sensor data only recorded the Current, not the Voltage. To solve this, we don't feed Voltage as a changing input. Instead, we either tell the AI, "Assume the battery is providing a constant 12 Volts while the motor is on," or we allow the AI to guess the average Voltage just like it guesses the motor's other internal properties (like resistance). Because the Voltage is just a steady driving force while the motor is on, this assumption is more than enough for the AI to balance its physics equations and successfully extract the ripples.</w:t>
-      </w:r>
-    </w:p>
-    <w:p>
-      <w:pPr>
-        <w:pStyle w:val="Heading1"/>
-      </w:pPr>
-      <w:r>
-        <w:t>6. The Output</w:t>
+        <w:t>5. The Output</w:t>
       </w:r>
     </w:p>
     <w:p>
@@ -185,7 +159,7 @@
         <w:t xml:space="preserve">Justification: </w:t>
       </w:r>
       <w:r>
-        <w:t>By designing the AI to have two separate outputs, we force it to literally untangle the signal for us. The AI is penalized if the "Baseline" output doesn't obey the smooth laws of physics. Because the Baseline is forced to be smooth, the AI has no choice but to dump all the tiny, jagged commutation waves into the "Ripple" output to make its final guess match the answer key. Once the AI finishes running, we can completely throw away the Baseline output and just run a simple peak-counter on the perfectly isolated Ripple output to get our final count.</w:t>
+        <w:t>By designing the AI to have two separate outputs, we force it to literally untangle the signal for us. The AI is penalized if the "Baseline" output doesn't perfectly match the physics of the measured Voltage we gave it. Because the Baseline is forced to be smooth, the AI has no choice but to dump all the tiny, jagged commutation waves into the "Ripple" output to make its final guess match the Current answer key. Once the AI finishes running, we can completely throw away the Baseline output and just run a simple peak-counter on the perfectly isolated Ripple output to get our final count.</w:t>
       </w:r>
     </w:p>
     <w:sectPr>

</xml_diff>

<commit_message>
Add exact NN architecture and detailed Loss Function equations
</commit_message>
<xml_diff>
--- a/PINN_Approach_Layman.docx
+++ b/PINN_Approach_Layman.docx
@@ -47,7 +47,7 @@
         <w:t xml:space="preserve">Choice of Model: </w:t>
       </w:r>
       <w:r>
-        <w:t>We are using an AI technique called a Physics-Informed Neural Network (PINN).</w:t>
+        <w:t>We are using a specialized AI technique called a Hybrid Fourier PINN for Inverse Signal Decomposition.</w:t>
       </w:r>
     </w:p>
     <w:p>
@@ -55,13 +55,21 @@
         <w:rPr>
           <w:b/>
         </w:rPr>
-        <w:t xml:space="preserve">Justification: </w:t>
+        <w:t xml:space="preserve">What Neural Network are we using?: </w:t>
       </w:r>
       <w:r>
-        <w:t>Normally, traditional software filters (like band-pass filters) try to find ripples by guessing their frequency. However, they get hopelessly confused by the massive power spikes when the motor turns on or off, mistakenly counting the spike as a giant ripple.</w:t>
+        <w:t>The model consists of two parallel Multi-Layer Perceptrons (MLPs). Specifically, they are standard feed-forward neural networks (e.g., 3 hidden layers of 128 neurons each). One MLP is dedicated to predicting the smooth 'Baseline' current, and the second parallel MLP is dedicated to predicting the jagged 'Ripple' current.</w:t>
         <w:br/>
         <w:br/>
-        <w:t>A PINN is different. We "teach" the AI the basic laws of physics (specifically, how electricity flows through copper wire and magnets). Because the AI understands physics, when it sees a massive power spike, it says, "Ah, that's just the motor turning on, that's not a ripple!" It safely ignores the chaotic power surges and perfectly extracts only the tiny, repetitive ripples. We don't need a deeply complex, black-box AI model - just a simple network that obeys basic electrical engineering rules.</w:t>
+      </w:r>
+      <w:r>
+        <w:rPr>
+          <w:b/>
+        </w:rPr>
+        <w:t xml:space="preserve">Fourier Feature Embedding: </w:t>
+      </w:r>
+      <w:r>
+        <w:t>A standard MLP suffers from 'spectral bias' - meaning it is mathematically biased toward learning smooth, slow-changing shapes and physically struggles to learn high-frequency, jagged shapes (like your commutation ripples). To fix this, we apply a 'Fourier Feature Embedding' on the input time before feeding it into the Ripple MLP. This means we mathematically map the time 't' into sines and cosines. This architectural trick gives the network the ability to easily learn and mimic the high-frequency repetitive ripples.</w:t>
       </w:r>
     </w:p>
     <w:p>
@@ -82,7 +90,7 @@
       <w:r>
         <w:t>The AI is fed exactly two things:</w:t>
         <w:br/>
-        <w:t>1. Time (for example, "What is happening at exactly 2.53 seconds?").</w:t>
+        <w:t>1. Time (t).</w:t>
         <w:br/>
         <w:t>2. Measured Voltage (the actual voltage sensor reading at that exact microsecond).</w:t>
       </w:r>
@@ -95,7 +103,7 @@
         <w:t xml:space="preserve">Justification: </w:t>
       </w:r>
       <w:r>
-        <w:t>To use the laws of physics, the AI must know the "pushing force" (Voltage) driving the motor at any given moment. By feeding the AI the Time and the true Voltage, the AI acts as a mathematical function generator. It uses the true Voltage to perfectly calculate what the smoothest, most physically realistic Baseline Current *should* be, rather than trying to blindly fix a noisy signal.</w:t>
+        <w:t>To use the laws of physics, the AI must know the "pushing force" (Voltage) driving the motor at any given moment. By feeding the AI the Time and the true Voltage, the AI acts as a mathematical function generator. It uses the true Voltage to calculate what the smoothest, most physically realistic Baseline Current *should* be, rather than trying to blindly fix a noisy signal.</w:t>
       </w:r>
     </w:p>
     <w:p>
@@ -103,37 +111,7 @@
         <w:pStyle w:val="Heading1"/>
       </w:pPr>
       <w:r>
-        <w:t>4. The Grader: Where the Actual Current is Used</w:t>
-      </w:r>
-    </w:p>
-    <w:p>
-      <w:r>
-        <w:rPr>
-          <w:b/>
-        </w:rPr>
-        <w:t xml:space="preserve">Feature Used: </w:t>
-      </w:r>
-      <w:r>
-        <w:t>The actual measured Current from your Excel sensor data is used exclusively in the "Loss Function" (the AI's grading rubric). It is NEVER used as an input.</w:t>
-      </w:r>
-    </w:p>
-    <w:p>
-      <w:r>
-        <w:rPr>
-          <w:b/>
-        </w:rPr>
-        <w:t xml:space="preserve">Justification: </w:t>
-      </w:r>
-      <w:r>
-        <w:t>If we fed the messy, noisy sensor Current directly into the AI as an input, the AI would just memorize the noise and hand it right back to us. Instead, the AI takes its guess (based purely on the Time and the Voltage), walks over to your Excel file, and checks the answer key. If the AI guesses the current is 8.5 Amps, but the Excel file says it was actually 9.2 Amps, the AI realizes it was off by 0.7 Amps. It takes that error, tweaks its internal math, and tries again. By using the actual Current only as an "answer key" to grade the AI, we force the AI to organically untangle the smooth motor physics from the jagged brush hits without cheating by looking at the noise directly.</w:t>
-      </w:r>
-    </w:p>
-    <w:p>
-      <w:pPr>
-        <w:pStyle w:val="Heading1"/>
-      </w:pPr>
-      <w:r>
-        <w:t>5. The Output</w:t>
+        <w:t>4. The Output (Decomposition)</w:t>
       </w:r>
     </w:p>
     <w:p>
@@ -146,9 +124,9 @@
       <w:r>
         <w:t>The AI outputs two separate numbers for every microsecond of time:</w:t>
         <w:br/>
-        <w:t>1. The smooth Baseline Current.</w:t>
+        <w:t>1. The smooth Baseline Current (from the first MLP).</w:t>
         <w:br/>
-        <w:t>2. The isolated Ripple Current.</w:t>
+        <w:t>2. The isolated Ripple Current (from the second MLP).</w:t>
       </w:r>
     </w:p>
     <w:p>
@@ -159,7 +137,73 @@
         <w:t xml:space="preserve">Justification: </w:t>
       </w:r>
       <w:r>
-        <w:t>By designing the AI to have two separate outputs, we force it to literally untangle the signal for us. The AI is penalized if the "Baseline" output doesn't perfectly match the physics of the measured Voltage we gave it. Because the Baseline is forced to be smooth, the AI has no choice but to dump all the tiny, jagged commutation waves into the "Ripple" output to make its final guess match the Current answer key. Once the AI finishes running, we can completely throw away the Baseline output and just run a simple peak-counter on the perfectly isolated Ripple output to get our final count.</w:t>
+        <w:t>By designing the AI to have two separate outputs, we force it to literally untangle the signal for us. Once the AI finishes running, we can completely throw away the Baseline output and just run a simple peak-counter on the perfectly isolated Ripple output to get our final count.</w:t>
+      </w:r>
+    </w:p>
+    <w:p>
+      <w:pPr>
+        <w:pStyle w:val="Heading1"/>
+      </w:pPr>
+      <w:r>
+        <w:t>5. The Grader: The Overall Loss Function</w:t>
+      </w:r>
+    </w:p>
+    <w:p>
+      <w:r>
+        <w:rPr>
+          <w:b/>
+        </w:rPr>
+        <w:t xml:space="preserve">Feature Used: </w:t>
+      </w:r>
+      <w:r>
+        <w:t>The actual measured Current from your Excel sensor data is used exclusively in the Loss Function (the AI's grading rubric). It is NEVER used as an input.</w:t>
+      </w:r>
+    </w:p>
+    <w:p>
+      <w:r>
+        <w:rPr>
+          <w:b/>
+        </w:rPr>
+        <w:t xml:space="preserve">The Exact Loss Function: </w:t>
+      </w:r>
+      <w:r>
+        <w:t>The network is trained by minimizing a composite loss function made of three distinct parts:</w:t>
+        <w:br/>
+        <w:br/>
+        <w:t>Total Loss = (?_data * Data_Loss) + (?_physics * Physics_Loss) + (?_smooth * Smoothness_Loss)</w:t>
+        <w:br/>
+        <w:br/>
+      </w:r>
+      <w:r>
+        <w:rPr>
+          <w:b/>
+        </w:rPr>
+        <w:t xml:space="preserve">1. Data Loss (Mean Squared Error): </w:t>
+      </w:r>
+      <w:r>
+        <w:t>This measures how far off the AI's total guess is from reality. The AI adds its Baseline guess and its Ripple guess together, and compares it against the true measured Current from the Excel file. If the sum doesn't perfectly match the real sensor data, the AI is heavily penalized.</w:t>
+        <w:br/>
+        <w:br/>
+      </w:r>
+      <w:r>
+        <w:rPr>
+          <w:b/>
+        </w:rPr>
+        <w:t xml:space="preserve">2. Physics Loss (ODE Constraint): </w:t>
+      </w:r>
+      <w:r>
+        <w:t>This is where the magic happens. We use automatic differentiation (autograd) to calculate the derivative of the AI's Baseline guess with respect to time (di/dt). We then plug this into the fundamental motor circuit differential equation:  V = L(di/dt) + R(i) + E. We use the measured Voltage (V) we fed as an input. If the AI's Baseline guess does not perfectly balance this equation, it is penalized. This forces the Baseline output to strictly obey the laws of physics.</w:t>
+        <w:br/>
+        <w:br/>
+      </w:r>
+      <w:r>
+        <w:rPr>
+          <w:b/>
+        </w:rPr>
+        <w:t xml:space="preserve">3. Smoothness Loss: </w:t>
+      </w:r>
+      <w:r>
+        <w:t>A small mathematical penalty applied only to the Baseline output that penalizes high-frequency changes. Because the Baseline is mathematically forced to be perfectly smooth by both the Physics Loss and the Smoothness Loss, the AI has no choice but to dump all the tiny, jagged commutation waves into the 'Ripple' output to satisfy the Data Loss. This organic struggle perfectly untangles the signal.</w:t>
       </w:r>
     </w:p>
     <w:sectPr>

</xml_diff>

<commit_message>
Add Data Labeling and NXP Embedded Deployment strategies
</commit_message>
<xml_diff>
--- a/PINN_Approach_Layman.docx
+++ b/PINN_Approach_Layman.docx
@@ -204,6 +204,72 @@
       </w:r>
       <w:r>
         <w:t>A small mathematical penalty applied only to the Baseline output that penalizes high-frequency changes. Because the Baseline is mathematically forced to be perfectly smooth by both the Physics Loss and the Smoothness Loss, the AI has no choice but to dump all the tiny, jagged commutation waves into the 'Ripple' output to satisfy the Data Loss. This organic struggle perfectly untangles the signal.</w:t>
+      </w:r>
+    </w:p>
+    <w:p>
+      <w:pPr>
+        <w:pStyle w:val="Heading1"/>
+      </w:pPr>
+      <w:r>
+        <w:t>6. The Data Labelling Problem</w:t>
+      </w:r>
+    </w:p>
+    <w:p>
+      <w:r>
+        <w:rPr>
+          <w:b/>
+        </w:rPr>
+        <w:t xml:space="preserve">The Challenge: </w:t>
+      </w:r>
+      <w:r>
+        <w:t>In order to deploy any reliable algorithm, you need 'Ground Truth' labels (knowing exactly where every single ripple truly is). However, manually labeling these ripples by human eye is nearly impossible because they are often completely buried inside noisy startup spikes.</w:t>
+        <w:br/>
+        <w:br/>
+      </w:r>
+      <w:r>
+        <w:rPr>
+          <w:b/>
+        </w:rPr>
+        <w:t xml:space="preserve">The PINN as an Auto-Labeler: </w:t>
+      </w:r>
+      <w:r>
+        <w:t>This is where the PINN truly shines. We use the PINN as an ultimate 'Auto-Labeler.' Because it uses pure physics to perfectly isolate the Ripple Current, we simply run the PINN offline, grab its clean Ripple output, and run a basic peak-finder on it. This automatically generates perfect, highly accurate timestamps for every single commutation event in your dataset, completely removing the need for manual human labeling.</w:t>
+      </w:r>
+    </w:p>
+    <w:p>
+      <w:pPr>
+        <w:pStyle w:val="Heading1"/>
+      </w:pPr>
+      <w:r>
+        <w:t>7. Embedded Deployment Strategy (NXP Microcontroller)</w:t>
+      </w:r>
+    </w:p>
+    <w:p>
+      <w:r>
+        <w:rPr>
+          <w:b/>
+        </w:rPr>
+        <w:t xml:space="preserve">The Challenge: </w:t>
+      </w:r>
+      <w:r>
+        <w:t>A PINN is mathematically heavy. It requires thousands of backpropagation iterations (training) to solve the physics equations for a single recording. It takes minutes to run on a Desktop CPU, meaning it is computationally impossible to run a live PINN on a resource-constrained NXP embedded microcontroller in real-time.</w:t>
+        <w:br/>
+        <w:br/>
+      </w:r>
+      <w:r>
+        <w:rPr>
+          <w:b/>
+        </w:rPr>
+        <w:t xml:space="preserve">The Deployment Solution (Offline to Online): </w:t>
+      </w:r>
+      <w:r>
+        <w:t>We do NOT deploy the PINN directly to the NXP chip. Instead, we use a two-step 'Offline-to-Online' strategy:</w:t>
+        <w:br/>
+        <w:br/>
+        <w:t>Step 1: Offline (PC/Server) - We run the heavy PINN on hundreds of your Excel motor recordings on a desktop computer. The PINN acts as our Auto-Labeler, generating a massive dataset of perfectly labeled ripple timestamps.</w:t>
+        <w:br/>
+        <w:br/>
+        <w:t>Step 2: Online (NXP Chip) - Now that we have a massive, perfectly labeled dataset, we can train an ultra-lightweight, lightning-fast algorithm (like a tiny 1D-CNN, or a highly tuned adaptive DSP filter). Because this lightweight algorithm was trained using the 'perfect' labels generated by the PINN, it inherits the PINN's accuracy but runs in microseconds. This tiny, lightning-fast model is what we actually flash onto the NXP microcontroller for real-time edge deployment.</w:t>
       </w:r>
     </w:p>
     <w:sectPr>

</xml_diff>

<commit_message>
Add visualizations for non-ML people and remove NXP deployment note
</commit_message>
<xml_diff>
--- a/PINN_Approach_Layman.docx
+++ b/PINN_Approach_Layman.docx
@@ -58,7 +58,7 @@
         <w:t xml:space="preserve">What Neural Network are we using?: </w:t>
       </w:r>
       <w:r>
-        <w:t>The model consists of two parallel Multi-Layer Perceptrons (MLPs). Specifically, they are standard feed-forward neural networks (e.g., 3 hidden layers of 128 neurons each). One MLP is dedicated to predicting the smooth 'Baseline' current, and the second parallel MLP is dedicated to predicting the jagged 'Ripple' current.</w:t>
+        <w:t>The model consists of two parallel standard feed-forward neural networks (e.g., 3 hidden layers of 128 neurons each). One network is dedicated to predicting the smooth 'Baseline' current, and the second parallel network is dedicated to predicting the jagged 'Ripple' current.</w:t>
         <w:br/>
         <w:br/>
       </w:r>
@@ -69,7 +69,7 @@
         <w:t xml:space="preserve">Fourier Feature Embedding: </w:t>
       </w:r>
       <w:r>
-        <w:t>A standard MLP suffers from 'spectral bias' - meaning it is mathematically biased toward learning smooth, slow-changing shapes and physically struggles to learn high-frequency, jagged shapes (like your commutation ripples). To fix this, we apply a 'Fourier Feature Embedding' on the input time before feeding it into the Ripple MLP. This means we mathematically map the time 't' into sines and cosines. This architectural trick gives the network the ability to easily learn and mimic the high-frequency repetitive ripples.</w:t>
+        <w:t>A standard neural network physically struggles to learn high-frequency, jagged shapes (like your commutation ripples). To fix this, we apply a 'Fourier Feature Embedding' on the input time before feeding it into the Ripple network. This mathematically maps the time 't' into sines and cosines, giving the network the ability to easily mimic the high-frequency repetitive ripples.</w:t>
       </w:r>
     </w:p>
     <w:p>
@@ -77,7 +77,7 @@
         <w:pStyle w:val="Heading1"/>
       </w:pPr>
       <w:r>
-        <w:t>3. The Inputs (Time and Voltage)</w:t>
+        <w:t>3. The Inputs to the AI</w:t>
       </w:r>
     </w:p>
     <w:p>
@@ -103,7 +103,7 @@
         <w:t xml:space="preserve">Justification: </w:t>
       </w:r>
       <w:r>
-        <w:t>To use the laws of physics, the AI must know the "pushing force" (Voltage) driving the motor at any given moment. By feeding the AI the Time and the true Voltage, the AI acts as a mathematical function generator. It uses the true Voltage to calculate what the smoothest, most physically realistic Baseline Current *should* be, rather than trying to blindly fix a noisy signal.</w:t>
+        <w:t>To use the laws of physics, the AI must know the "pushing force" (Voltage) driving the motor at any given moment. By feeding the AI the Time and the true Voltage, the AI acts as a mathematical function generator. It uses the true Voltage to perfectly calculate what the smoothest, most physically realistic Baseline Current *should* be.</w:t>
       </w:r>
     </w:p>
     <w:p>
@@ -124,9 +124,45 @@
       <w:r>
         <w:t>The AI outputs two separate numbers for every microsecond of time:</w:t>
         <w:br/>
-        <w:t>1. The smooth Baseline Current (from the first MLP).</w:t>
+        <w:t>1. The smooth Baseline Current.</w:t>
         <w:br/>
-        <w:t>2. The isolated Ripple Current (from the second MLP).</w:t>
+        <w:t>2. The isolated Ripple Current.</w:t>
+      </w:r>
+    </w:p>
+    <w:p>
+      <w:r>
+        <w:drawing>
+          <wp:inline xmlns:a="http://schemas.openxmlformats.org/drawingml/2006/main" xmlns:pic="http://schemas.openxmlformats.org/drawingml/2006/picture">
+            <wp:extent cx="5486400" cy="2743200"/>
+            <wp:docPr id="1" name="Picture 1"/>
+            <wp:cNvGraphicFramePr>
+              <a:graphicFrameLocks noChangeAspect="1"/>
+            </wp:cNvGraphicFramePr>
+            <a:graphic>
+              <a:graphicData uri="http://schemas.openxmlformats.org/drawingml/2006/picture">
+                <pic:pic>
+                  <pic:nvPicPr>
+                    <pic:cNvPr id="0" name="pinn_viz_1.png"/>
+                    <pic:cNvPicPr/>
+                  </pic:nvPicPr>
+                  <pic:blipFill>
+                    <a:blip r:embed="rId9"/>
+                    <a:stretch>
+                      <a:fillRect/>
+                    </a:stretch>
+                  </pic:blipFill>
+                  <pic:spPr>
+                    <a:xfrm>
+                      <a:off x="0" y="0"/>
+                      <a:ext cx="5486400" cy="2743200"/>
+                    </a:xfrm>
+                    <a:prstGeom prst="rect"/>
+                  </pic:spPr>
+                </pic:pic>
+              </a:graphicData>
+            </a:graphic>
+          </wp:inline>
+        </w:drawing>
       </w:r>
     </w:p>
     <w:p>
@@ -137,7 +173,7 @@
         <w:t xml:space="preserve">Justification: </w:t>
       </w:r>
       <w:r>
-        <w:t>By designing the AI to have two separate outputs, we force it to literally untangle the signal for us. Once the AI finishes running, we can completely throw away the Baseline output and just run a simple peak-counter on the perfectly isolated Ripple output to get our final count.</w:t>
+        <w:t>By designing the AI to have two separate outputs, we force it to literally untangle the signal for us. The AI is mathematically forced to make Output 1 perfectly smooth. As a result, it has no choice but to dump all the tiny, jagged commutation waves into Output 2.</w:t>
       </w:r>
     </w:p>
     <w:p>
@@ -145,7 +181,56 @@
         <w:pStyle w:val="Heading1"/>
       </w:pPr>
       <w:r>
-        <w:t>5. The Grader: The Overall Loss Function</w:t>
+        <w:t>5. How to Get the Final Ripple Count</w:t>
+      </w:r>
+    </w:p>
+    <w:p>
+      <w:r>
+        <w:t>Once the AI finishes untangling the signal, getting the final ripple count is incredibly simple. We completely throw away the Baseline output (Output 1). We take the perfectly isolated Ripple output (Output 2) and run a standard peak-counting algorithm on it. Because the signal is now perfectly clean and hovering around zero, every single peak is a guaranteed commutator ripple.</w:t>
+      </w:r>
+    </w:p>
+    <w:p>
+      <w:r>
+        <w:drawing>
+          <wp:inline xmlns:a="http://schemas.openxmlformats.org/drawingml/2006/main" xmlns:pic="http://schemas.openxmlformats.org/drawingml/2006/picture">
+            <wp:extent cx="5486400" cy="2057400"/>
+            <wp:docPr id="2" name="Picture 2"/>
+            <wp:cNvGraphicFramePr>
+              <a:graphicFrameLocks noChangeAspect="1"/>
+            </wp:cNvGraphicFramePr>
+            <a:graphic>
+              <a:graphicData uri="http://schemas.openxmlformats.org/drawingml/2006/picture">
+                <pic:pic>
+                  <pic:nvPicPr>
+                    <pic:cNvPr id="0" name="pinn_viz_2.png"/>
+                    <pic:cNvPicPr/>
+                  </pic:nvPicPr>
+                  <pic:blipFill>
+                    <a:blip r:embed="rId10"/>
+                    <a:stretch>
+                      <a:fillRect/>
+                    </a:stretch>
+                  </pic:blipFill>
+                  <pic:spPr>
+                    <a:xfrm>
+                      <a:off x="0" y="0"/>
+                      <a:ext cx="5486400" cy="2057400"/>
+                    </a:xfrm>
+                    <a:prstGeom prst="rect"/>
+                  </pic:spPr>
+                </pic:pic>
+              </a:graphicData>
+            </a:graphic>
+          </wp:inline>
+        </w:drawing>
+      </w:r>
+    </w:p>
+    <w:p>
+      <w:pPr>
+        <w:pStyle w:val="Heading1"/>
+      </w:pPr>
+      <w:r>
+        <w:t>6. The Grader: How the AI learns</w:t>
       </w:r>
     </w:p>
     <w:p>
@@ -211,7 +296,7 @@
         <w:pStyle w:val="Heading1"/>
       </w:pPr>
       <w:r>
-        <w:t>6. The Data Labelling Problem</w:t>
+        <w:t>7. The Ultimate Auto-Labeler</w:t>
       </w:r>
     </w:p>
     <w:p>
@@ -222,7 +307,7 @@
         <w:t xml:space="preserve">The Challenge: </w:t>
       </w:r>
       <w:r>
-        <w:t>In order to deploy any reliable algorithm, you need 'Ground Truth' labels (knowing exactly where every single ripple truly is). However, manually labeling these ripples by human eye is nearly impossible because they are often completely buried inside noisy startup spikes.</w:t>
+        <w:t>In order to deploy any reliable ripple-counting algorithm on a microchip, you first need 'Ground Truth' labels (knowing exactly where every single ripple truly is). However, manually labeling these ripples by human eye is nearly impossible because they are often completely buried inside noisy startup spikes.</w:t>
         <w:br/>
         <w:br/>
       </w:r>
@@ -230,46 +315,10 @@
         <w:rPr>
           <w:b/>
         </w:rPr>
-        <w:t xml:space="preserve">The PINN as an Auto-Labeler: </w:t>
+        <w:t xml:space="preserve">The Solution: </w:t>
       </w:r>
       <w:r>
-        <w:t>This is where the PINN truly shines. We use the PINN as an ultimate 'Auto-Labeler.' Because it uses pure physics to perfectly isolate the Ripple Current, we simply run the PINN offline, grab its clean Ripple output, and run a basic peak-finder on it. This automatically generates perfect, highly accurate timestamps for every single commutation event in your dataset, completely removing the need for manual human labeling.</w:t>
-      </w:r>
-    </w:p>
-    <w:p>
-      <w:pPr>
-        <w:pStyle w:val="Heading1"/>
-      </w:pPr>
-      <w:r>
-        <w:t>7. Embedded Deployment Strategy (NXP Microcontroller)</w:t>
-      </w:r>
-    </w:p>
-    <w:p>
-      <w:r>
-        <w:rPr>
-          <w:b/>
-        </w:rPr>
-        <w:t xml:space="preserve">The Challenge: </w:t>
-      </w:r>
-      <w:r>
-        <w:t>A PINN is mathematically heavy. It requires thousands of backpropagation iterations (training) to solve the physics equations for a single recording. It takes minutes to run on a Desktop CPU, meaning it is computationally impossible to run a live PINN on a resource-constrained NXP embedded microcontroller in real-time.</w:t>
-        <w:br/>
-        <w:br/>
-      </w:r>
-      <w:r>
-        <w:rPr>
-          <w:b/>
-        </w:rPr>
-        <w:t xml:space="preserve">The Deployment Solution (Offline to Online): </w:t>
-      </w:r>
-      <w:r>
-        <w:t>We do NOT deploy the PINN directly to the NXP chip. Instead, we use a two-step 'Offline-to-Online' strategy:</w:t>
-        <w:br/>
-        <w:br/>
-        <w:t>Step 1: Offline (PC/Server) - We run the heavy PINN on hundreds of your Excel motor recordings on a desktop computer. The PINN acts as our Auto-Labeler, generating a massive dataset of perfectly labeled ripple timestamps.</w:t>
-        <w:br/>
-        <w:br/>
-        <w:t>Step 2: Online (NXP Chip) - Now that we have a massive, perfectly labeled dataset, we can train an ultra-lightweight, lightning-fast algorithm (like a tiny 1D-CNN, or a highly tuned adaptive DSP filter). Because this lightweight algorithm was trained using the 'perfect' labels generated by the PINN, it inherits the PINN's accuracy but runs in microseconds. This tiny, lightning-fast model is what we actually flash onto the NXP microcontroller for real-time edge deployment.</w:t>
+        <w:t>This is where the PINN truly shines. We use the PINN as an offline 'Auto-Labeler.' Because it perfectly isolates the Ripple Current, we can automatically generate highly accurate timestamps for every single commutation event in your dataset, completely removing the need for manual human labeling.</w:t>
       </w:r>
     </w:p>
     <w:sectPr>

</xml_diff>

<commit_message>
Add detailed explanation and visualization for how physics enforces the envelope
</commit_message>
<xml_diff>
--- a/PINN_Approach_Layman.docx
+++ b/PINN_Approach_Layman.docx
@@ -124,7 +124,7 @@
       <w:r>
         <w:t>The AI outputs two separate numbers for every microsecond of time:</w:t>
         <w:br/>
-        <w:t>1. The smooth Baseline Current.</w:t>
+        <w:t>1. The smooth Baseline Current (The Envelope).</w:t>
         <w:br/>
         <w:t>2. The isolated Ripple Current.</w:t>
       </w:r>
@@ -166,14 +166,63 @@
       </w:r>
     </w:p>
     <w:p>
+      <w:pPr>
+        <w:pStyle w:val="Heading1"/>
+      </w:pPr>
+      <w:r>
+        <w:t>5. How the AI Knows to Draw the 'Envelope'</w:t>
+      </w:r>
+    </w:p>
+    <w:p>
       <w:r>
         <w:rPr>
           <w:b/>
         </w:rPr>
-        <w:t xml:space="preserve">Justification: </w:t>
+        <w:t>A common question is: How does the AI know to draw the curved 'envelope' instead of just drawing the jagged ripples into Output 1?</w:t>
+        <w:br/>
+        <w:br/>
       </w:r>
       <w:r>
-        <w:t>By designing the AI to have two separate outputs, we force it to literally untangle the signal for us. The AI is mathematically forced to make Output 1 perfectly smooth. As a result, it has no choice but to dump all the tiny, jagged commutation waves into Output 2.</w:t>
+        <w:t>The answer lies entirely in the physics of the motor's Inductor (the copper coils). In physics, an inductor acts like a heavy flywheel - it physically resists rapid, sudden changes in current. Because we force Output 1 to obey the motor's electrical equation (V = L(di/dt) + Ri + E), the AI is heavily penalized if it tries to draw fast, jagged wiggles into the Baseline. If it tries to put ripples into the Baseline, the math for the inductor explodes, and the AI fails its test.</w:t>
+        <w:br/>
+        <w:br/>
+        <w:t>Because the AI is mathematically forced to obey the heavy, slow-moving physics of the inductor, it is physically impossible for it to draw the fast, jagged ripples. It is strictly forced to draw the smoothest possible curve that traces the massive power surges of the motor turning on and off (the envelope). To make its final math match your Excel file, it has no choice but to take all the fast, jagged ripples that it wasn't allowed to draw, and dump them into Output 2 (the Ripple output).</w:t>
+      </w:r>
+    </w:p>
+    <w:p>
+      <w:r>
+        <w:drawing>
+          <wp:inline xmlns:a="http://schemas.openxmlformats.org/drawingml/2006/main" xmlns:pic="http://schemas.openxmlformats.org/drawingml/2006/picture">
+            <wp:extent cx="5486400" cy="2743200"/>
+            <wp:docPr id="2" name="Picture 2"/>
+            <wp:cNvGraphicFramePr>
+              <a:graphicFrameLocks noChangeAspect="1"/>
+            </wp:cNvGraphicFramePr>
+            <a:graphic>
+              <a:graphicData uri="http://schemas.openxmlformats.org/drawingml/2006/picture">
+                <pic:pic>
+                  <pic:nvPicPr>
+                    <pic:cNvPr id="0" name="pinn_viz_3.png"/>
+                    <pic:cNvPicPr/>
+                  </pic:nvPicPr>
+                  <pic:blipFill>
+                    <a:blip r:embed="rId10"/>
+                    <a:stretch>
+                      <a:fillRect/>
+                    </a:stretch>
+                  </pic:blipFill>
+                  <pic:spPr>
+                    <a:xfrm>
+                      <a:off x="0" y="0"/>
+                      <a:ext cx="5486400" cy="2743200"/>
+                    </a:xfrm>
+                    <a:prstGeom prst="rect"/>
+                  </pic:spPr>
+                </pic:pic>
+              </a:graphicData>
+            </a:graphic>
+          </wp:inline>
+        </w:drawing>
       </w:r>
     </w:p>
     <w:p>
@@ -181,7 +230,7 @@
         <w:pStyle w:val="Heading1"/>
       </w:pPr>
       <w:r>
-        <w:t>5. How to Get the Final Ripple Count</w:t>
+        <w:t>6. How to Get the Final Ripple Count</w:t>
       </w:r>
     </w:p>
     <w:p>
@@ -194,7 +243,7 @@
         <w:drawing>
           <wp:inline xmlns:a="http://schemas.openxmlformats.org/drawingml/2006/main" xmlns:pic="http://schemas.openxmlformats.org/drawingml/2006/picture">
             <wp:extent cx="5486400" cy="2057400"/>
-            <wp:docPr id="2" name="Picture 2"/>
+            <wp:docPr id="3" name="Picture 3"/>
             <wp:cNvGraphicFramePr>
               <a:graphicFrameLocks noChangeAspect="1"/>
             </wp:cNvGraphicFramePr>
@@ -206,7 +255,7 @@
                     <pic:cNvPicPr/>
                   </pic:nvPicPr>
                   <pic:blipFill>
-                    <a:blip r:embed="rId10"/>
+                    <a:blip r:embed="rId11"/>
                     <a:stretch>
                       <a:fillRect/>
                     </a:stretch>
@@ -230,7 +279,7 @@
         <w:pStyle w:val="Heading1"/>
       </w:pPr>
       <w:r>
-        <w:t>6. The Grader: How the AI learns</w:t>
+        <w:t>7. The Grader: How the AI learns</w:t>
       </w:r>
     </w:p>
     <w:p>
@@ -277,7 +326,7 @@
         <w:t xml:space="preserve">2. Physics Loss (ODE Constraint): </w:t>
       </w:r>
       <w:r>
-        <w:t>This is where the magic happens. We use automatic differentiation (autograd) to calculate the derivative of the AI's Baseline guess with respect to time (di/dt). We then plug this into the fundamental motor circuit differential equation:  V = L(di/dt) + R(i) + E. We use the measured Voltage (V) we fed as an input. If the AI's Baseline guess does not perfectly balance this equation, it is penalized. This forces the Baseline output to strictly obey the laws of physics.</w:t>
+        <w:t>As shown in the envelope section, we use automatic differentiation (autograd) to calculate the derivative of the AI's Baseline guess with respect to time (di/dt). We then plug this into the fundamental motor circuit differential equation. If the AI's Baseline guess does not perfectly balance this equation, it is penalized. This forces the Baseline output to strictly obey the laws of physics.</w:t>
         <w:br/>
         <w:br/>
       </w:r>
@@ -296,7 +345,7 @@
         <w:pStyle w:val="Heading1"/>
       </w:pPr>
       <w:r>
-        <w:t>7. The Ultimate Auto-Labeler</w:t>
+        <w:t>8. The Ultimate Auto-Labeler</w:t>
       </w:r>
     </w:p>
     <w:p>

</xml_diff>

<commit_message>
Update PINN docx with I/O block diagram and explain Self-Supervised nature
</commit_message>
<xml_diff>
--- a/PINN_Approach_Layman.docx
+++ b/PINN_Approach_Layman.docx
@@ -36,7 +36,43 @@
         <w:pStyle w:val="Heading1"/>
       </w:pPr>
       <w:r>
-        <w:t>2. The Solution: Physics-Informed Neural Networks (PINN)</w:t>
+        <w:t>2. The Input and Output Flow</w:t>
+      </w:r>
+    </w:p>
+    <w:p>
+      <w:r>
+        <w:drawing>
+          <wp:inline xmlns:a="http://schemas.openxmlformats.org/drawingml/2006/main" xmlns:pic="http://schemas.openxmlformats.org/drawingml/2006/picture">
+            <wp:extent cx="5486400" cy="2973334"/>
+            <wp:docPr id="1" name="Picture 1"/>
+            <wp:cNvGraphicFramePr>
+              <a:graphicFrameLocks noChangeAspect="1"/>
+            </wp:cNvGraphicFramePr>
+            <a:graphic>
+              <a:graphicData uri="http://schemas.openxmlformats.org/drawingml/2006/picture">
+                <pic:pic>
+                  <pic:nvPicPr>
+                    <pic:cNvPr id="0" name="pinn_viz_4.png"/>
+                    <pic:cNvPicPr/>
+                  </pic:nvPicPr>
+                  <pic:blipFill>
+                    <a:blip r:embed="rId9"/>
+                    <a:stretch>
+                      <a:fillRect/>
+                    </a:stretch>
+                  </pic:blipFill>
+                  <pic:spPr>
+                    <a:xfrm>
+                      <a:off x="0" y="0"/>
+                      <a:ext cx="5486400" cy="2973334"/>
+                    </a:xfrm>
+                    <a:prstGeom prst="rect"/>
+                  </pic:spPr>
+                </pic:pic>
+              </a:graphicData>
+            </a:graphic>
+          </wp:inline>
+        </w:drawing>
       </w:r>
     </w:p>
     <w:p>
@@ -44,10 +80,18 @@
         <w:rPr>
           <w:b/>
         </w:rPr>
-        <w:t xml:space="preserve">Choice of Model: </w:t>
+        <w:t xml:space="preserve">How it achieves the task: </w:t>
       </w:r>
       <w:r>
-        <w:t>We are using a specialized AI technique called a Hybrid Fourier PINN for Inverse Signal Decomposition.</w:t>
+        <w:t>As shown in the diagram above, the AI is fed exactly two inputs: Time and Voltage. It processes these inputs and produces two distinct outputs: Output 1 (the smooth Baseline) and Output 2 (the isolated Ripples). We then discard Output 1 and simply pass Output 2 into a standard peak counter to get our final ripple count. The rest of this document explains exactly how the AI separates these two outputs.</w:t>
+      </w:r>
+    </w:p>
+    <w:p>
+      <w:pPr>
+        <w:pStyle w:val="Heading1"/>
+      </w:pPr>
+      <w:r>
+        <w:t>3. Is the Neural Network Labeled? (Self-Supervised)</w:t>
       </w:r>
     </w:p>
     <w:p>
@@ -55,55 +99,10 @@
         <w:rPr>
           <w:b/>
         </w:rPr>
-        <w:t xml:space="preserve">What Neural Network are we using?: </w:t>
+        <w:t xml:space="preserve">No Human Labels Needed: </w:t>
       </w:r>
       <w:r>
-        <w:t>The model consists of two parallel standard feed-forward neural networks (e.g., 3 hidden layers of 128 neurons each). One network is dedicated to predicting the smooth 'Baseline' current, and the second parallel network is dedicated to predicting the jagged 'Ripple' current.</w:t>
-        <w:br/>
-        <w:br/>
-      </w:r>
-      <w:r>
-        <w:rPr>
-          <w:b/>
-        </w:rPr>
-        <w:t xml:space="preserve">Fourier Feature Embedding: </w:t>
-      </w:r>
-      <w:r>
-        <w:t>A standard neural network physically struggles to learn high-frequency, jagged shapes (like your commutation ripples). To fix this, we apply a 'Fourier Feature Embedding' on the input time before feeding it into the Ripple network. This mathematically maps the time 't' into sines and cosines, giving the network the ability to easily mimic the high-frequency repetitive ripples.</w:t>
-      </w:r>
-    </w:p>
-    <w:p>
-      <w:pPr>
-        <w:pStyle w:val="Heading1"/>
-      </w:pPr>
-      <w:r>
-        <w:t>3. The Inputs to the AI</w:t>
-      </w:r>
-    </w:p>
-    <w:p>
-      <w:r>
-        <w:rPr>
-          <w:b/>
-        </w:rPr>
-        <w:t xml:space="preserve">Input Features: </w:t>
-      </w:r>
-      <w:r>
-        <w:t>The AI is fed exactly two things:</w:t>
-        <w:br/>
-        <w:t>1. Time (t).</w:t>
-        <w:br/>
-        <w:t>2. Measured Voltage (the actual voltage sensor reading at that exact microsecond).</w:t>
-      </w:r>
-    </w:p>
-    <w:p>
-      <w:r>
-        <w:rPr>
-          <w:b/>
-        </w:rPr>
-        <w:t xml:space="preserve">Justification: </w:t>
-      </w:r>
-      <w:r>
-        <w:t>To use the laws of physics, the AI must know the "pushing force" (Voltage) driving the motor at any given moment. By feeding the AI the Time and the true Voltage, the AI acts as a mathematical function generator. It uses the true Voltage to perfectly calculate what the smoothest, most physically realistic Baseline Current *should* be.</w:t>
+        <w:t>A very common question is 'What labels are we using to train the AI?' The beauty of this approach is that we do NOT use human labels. You don't need to manually click and label where the ripples are. Instead, the model is 'Self-Supervised' using the laws of physics. The AI takes the Time and Voltage, guesses the Current, and checks its own work against the raw sensor Current from the Excel file. Because it is mathematically restricted by the motor's physics, it is forced to organically separate the ripples in order to make its math match the raw sensor data.</w:t>
       </w:r>
     </w:p>
     <w:p>
@@ -116,17 +115,7 @@
     </w:p>
     <w:p>
       <w:r>
-        <w:rPr>
-          <w:b/>
-        </w:rPr>
-        <w:t xml:space="preserve">Output Features: </w:t>
-      </w:r>
-      <w:r>
-        <w:t>The AI outputs two separate numbers for every microsecond of time:</w:t>
-        <w:br/>
-        <w:t>1. The smooth Baseline Current (The Envelope).</w:t>
-        <w:br/>
-        <w:t>2. The isolated Ripple Current.</w:t>
+        <w:t>By designing the AI to have two separate outputs, we force it to literally untangle the signal for us. The AI is mathematically forced to make Output 1 perfectly smooth. As a result, it has no choice but to dump all the tiny, jagged commutation waves into Output 2.</w:t>
       </w:r>
     </w:p>
     <w:p>
@@ -134,7 +123,7 @@
         <w:drawing>
           <wp:inline xmlns:a="http://schemas.openxmlformats.org/drawingml/2006/main" xmlns:pic="http://schemas.openxmlformats.org/drawingml/2006/picture">
             <wp:extent cx="5486400" cy="2743200"/>
-            <wp:docPr id="1" name="Picture 1"/>
+            <wp:docPr id="2" name="Picture 2"/>
             <wp:cNvGraphicFramePr>
               <a:graphicFrameLocks noChangeAspect="1"/>
             </wp:cNvGraphicFramePr>
@@ -146,7 +135,7 @@
                     <pic:cNvPicPr/>
                   </pic:nvPicPr>
                   <pic:blipFill>
-                    <a:blip r:embed="rId9"/>
+                    <a:blip r:embed="rId10"/>
                     <a:stretch>
                       <a:fillRect/>
                     </a:stretch>
@@ -194,7 +183,7 @@
         <w:drawing>
           <wp:inline xmlns:a="http://schemas.openxmlformats.org/drawingml/2006/main" xmlns:pic="http://schemas.openxmlformats.org/drawingml/2006/picture">
             <wp:extent cx="5486400" cy="2743200"/>
-            <wp:docPr id="2" name="Picture 2"/>
+            <wp:docPr id="3" name="Picture 3"/>
             <wp:cNvGraphicFramePr>
               <a:graphicFrameLocks noChangeAspect="1"/>
             </wp:cNvGraphicFramePr>
@@ -206,7 +195,7 @@
                     <pic:cNvPicPr/>
                   </pic:nvPicPr>
                   <pic:blipFill>
-                    <a:blip r:embed="rId10"/>
+                    <a:blip r:embed="rId11"/>
                     <a:stretch>
                       <a:fillRect/>
                     </a:stretch>
@@ -243,7 +232,7 @@
         <w:drawing>
           <wp:inline xmlns:a="http://schemas.openxmlformats.org/drawingml/2006/main" xmlns:pic="http://schemas.openxmlformats.org/drawingml/2006/picture">
             <wp:extent cx="5486400" cy="2057400"/>
-            <wp:docPr id="3" name="Picture 3"/>
+            <wp:docPr id="4" name="Picture 4"/>
             <wp:cNvGraphicFramePr>
               <a:graphicFrameLocks noChangeAspect="1"/>
             </wp:cNvGraphicFramePr>
@@ -255,7 +244,7 @@
                     <pic:cNvPicPr/>
                   </pic:nvPicPr>
                   <pic:blipFill>
-                    <a:blip r:embed="rId11"/>
+                    <a:blip r:embed="rId12"/>
                     <a:stretch>
                       <a:fillRect/>
                     </a:stretch>
@@ -279,7 +268,7 @@
         <w:pStyle w:val="Heading1"/>
       </w:pPr>
       <w:r>
-        <w:t>7. The Grader: How the AI learns</w:t>
+        <w:t>7. The Grader: The Math Behind the Learning</w:t>
       </w:r>
     </w:p>
     <w:p>
@@ -338,36 +327,6 @@
       </w:r>
       <w:r>
         <w:t>A small mathematical penalty applied only to the Baseline output that penalizes high-frequency changes. Because the Baseline is mathematically forced to be perfectly smooth by both the Physics Loss and the Smoothness Loss, the AI has no choice but to dump all the tiny, jagged commutation waves into the 'Ripple' output to satisfy the Data Loss. This organic struggle perfectly untangles the signal.</w:t>
-      </w:r>
-    </w:p>
-    <w:p>
-      <w:pPr>
-        <w:pStyle w:val="Heading1"/>
-      </w:pPr>
-      <w:r>
-        <w:t>8. The Ultimate Auto-Labeler</w:t>
-      </w:r>
-    </w:p>
-    <w:p>
-      <w:r>
-        <w:rPr>
-          <w:b/>
-        </w:rPr>
-        <w:t xml:space="preserve">The Challenge: </w:t>
-      </w:r>
-      <w:r>
-        <w:t>In order to deploy any reliable ripple-counting algorithm on a microchip, you first need 'Ground Truth' labels (knowing exactly where every single ripple truly is). However, manually labeling these ripples by human eye is nearly impossible because they are often completely buried inside noisy startup spikes.</w:t>
-        <w:br/>
-        <w:br/>
-      </w:r>
-      <w:r>
-        <w:rPr>
-          <w:b/>
-        </w:rPr>
-        <w:t xml:space="preserve">The Solution: </w:t>
-      </w:r>
-      <w:r>
-        <w:t>This is where the PINN truly shines. We use the PINN as an offline 'Auto-Labeler.' Because it perfectly isolates the Ripple Current, we can automatically generate highly accurate timestamps for every single commutation event in your dataset, completely removing the need for manual human labeling.</w:t>
       </w:r>
     </w:p>
     <w:sectPr>

</xml_diff>

<commit_message>
Expand Flow section to explain point-by-point wave reconstruction and justify Time/Voltage inputs
</commit_message>
<xml_diff>
--- a/PINN_Approach_Layman.docx
+++ b/PINN_Approach_Layman.docx
@@ -80,10 +80,49 @@
         <w:rPr>
           <w:b/>
         </w:rPr>
-        <w:t xml:space="preserve">How it achieves the task: </w:t>
+        <w:t>Explicit MLP Inputs and Outputs:</w:t>
+        <w:br/>
       </w:r>
       <w:r>
-        <w:t>As shown in the diagram above, the AI is fed exactly two inputs: Time and Voltage. It processes these inputs and produces two distinct outputs: Output 1 (the smooth Baseline) and Output 2 (the isolated Ripples). We then discard Output 1 and simply pass Output 2 into a standard peak counter to get our final ripple count. The rest of this document explains exactly how the AI separates these two outputs.</w:t>
+        <w:t>The Multi-Layer Perceptron (MLP) acts as a mathematical function generator. At any given microsecond, it looks at exactly two input numbers and spits out exactly two output numbers.</w:t>
+        <w:br/>
+        <w:t>- MLP Inputs (2 Nodes): [Time, Voltage]</w:t>
+        <w:br/>
+        <w:t>- MLP Outputs (2 Nodes): [Baseline Current, Ripple Current]</w:t>
+        <w:br/>
+        <w:br/>
+      </w:r>
+    </w:p>
+    <w:p>
+      <w:r>
+        <w:rPr>
+          <w:b/>
+        </w:rPr>
+        <w:t>How the wave reconstruction works:</w:t>
+        <w:br/>
+      </w:r>
+      <w:r>
+        <w:t>We don't feed the entire waveform into the AI all at once. Instead, we feed it point-by-point. For a specific instant in time (e.g., t = 0.5s), we feed the AI that Time and the Voltage at that exact instant. The AI calculates and outputs the Current for that single instant. By repeating this process thousands of times across the timeline, the AI plots points that completely reconstruct the continuous current wave from scratch. It then combines the Baseline and the Ripple outputs to see if its 'reconstructed' wave matches the real Excel sensor data.</w:t>
+        <w:br/>
+        <w:br/>
+      </w:r>
+    </w:p>
+    <w:p>
+      <w:r>
+        <w:rPr>
+          <w:b/>
+        </w:rPr>
+        <w:t>Why reconstruct from Time and Voltage? (Why not use other parameters?)</w:t>
+        <w:br/>
+      </w:r>
+      <w:r>
+        <w:t>It is critical that we use Time and Voltage to 'build' the current from scratch, rather than using the Raw Current as an input. Here is why:</w:t>
+        <w:br/>
+        <w:t>1. Voltage is the 'Cause': In physics, voltage is the driving force that creates current. By starting with the cause, we force the AI to use the laws of physics to determine the effect.</w:t>
+        <w:br/>
+        <w:t>2. Why not use Current as an input?: If we fed the raw, noisy Current into the AI as an input, the AI would take the lazy route. It would just perfectly copy the input to the output (a 1:1 mapping) without learning any physics at all. By hiding the raw current from the input layer and only using it at the very end to grade the AI, we force the AI to genuinely untangle the signal.</w:t>
+        <w:br/>
+        <w:t>3. Why not use Speed or Position?: We don't have those sensors! The entire point of this project is 'sensorless' counting. Since we only have a voltage and current sensor, we must rely exclusively on those two variables.</w:t>
       </w:r>
     </w:p>
     <w:p>

</xml_diff>

<commit_message>
Add Alternative Models discussion and justify Timestamp feature selection
</commit_message>
<xml_diff>
--- a/PINN_Approach_Layman.docx
+++ b/PINN_Approach_Layman.docx
@@ -36,7 +36,82 @@
         <w:pStyle w:val="Heading1"/>
       </w:pPr>
       <w:r>
-        <w:t>2. The Input and Output Flow</w:t>
+        <w:t>2. Alternative Models Considered (For Discussion)</w:t>
+      </w:r>
+    </w:p>
+    <w:p>
+      <w:r>
+        <w:t>Before arriving at our final solution, we considered several other approaches for this task. Here is why they were rejected:</w:t>
+        <w:br/>
+        <w:br/>
+      </w:r>
+      <w:r>
+        <w:rPr>
+          <w:b/>
+        </w:rPr>
+        <w:t>Model 1: Traditional DSP Filters (e.g., Bandpass / Highpass)</w:t>
+        <w:br/>
+      </w:r>
+      <w:r>
+        <w:t>- How it works: Attempts to block low frequencies (the baseline) and only let high frequencies (the ripples) pass through.</w:t>
+        <w:br/>
+        <w:t>- Why it fails: During motor startup, the current surges incredibly fast. This massive transient spike contains high-frequency energy. A traditional filter gets confused, cannot distinguish the startup spike from a commutator ripple, and triggers dozens of fake ripple counts.</w:t>
+        <w:br/>
+        <w:br/>
+      </w:r>
+      <w:r>
+        <w:rPr>
+          <w:b/>
+        </w:rPr>
+        <w:t>Model 2: Supervised Machine Learning (e.g., 1D-CNN or LSTM)</w:t>
+        <w:br/>
+      </w:r>
+      <w:r>
+        <w:t>- How it works: Feeds the raw current into a deep neural network that has been trained to find ripples based on examples.</w:t>
+        <w:br/>
+        <w:t>- Why it fails: Supervised ML requires thousands of hours of manual human labeling ('Ground Truth'). Because the ripples are buried in noise, humans physically cannot label them accurately by eye. The model would be trained on bad data.</w:t>
+        <w:br/>
+        <w:br/>
+      </w:r>
+      <w:r>
+        <w:rPr>
+          <w:b/>
+        </w:rPr>
+        <w:t>Model 3: Standard PINN (Without Fourier Features)</w:t>
+        <w:br/>
+      </w:r>
+      <w:r>
+        <w:t>- How it works: Uses physics equations to guide a standard Neural Network.</w:t>
+        <w:br/>
+        <w:t>- Why it fails: Neural networks suffer from 'Spectral Bias' - they physically struggle to learn high-frequency, jagged shapes. A standard PINN will learn the smooth motor startup perfectly but will completely blur out the fast commutation ripples.</w:t>
+        <w:br/>
+      </w:r>
+    </w:p>
+    <w:p>
+      <w:pPr>
+        <w:pStyle w:val="Heading1"/>
+      </w:pPr>
+      <w:r>
+        <w:t>3. Why the Hybrid Fourier PINN is the Best Fit</w:t>
+      </w:r>
+    </w:p>
+    <w:p>
+      <w:r>
+        <w:t>The Hybrid Fourier PINN specifically addresses the critical flaws of every other method:</w:t>
+        <w:br/>
+        <w:t>1. It solves Model 1's flaw by using actual Motor Physics (instead of dumb frequency cutoffs) to perfectly understand and ignore the massive startup spikes.</w:t>
+        <w:br/>
+        <w:t>2. It solves Model 2's flaw by being 'Self-Supervised'. Because it uses physics to grade its own work, it requires zero manual human labels.</w:t>
+        <w:br/>
+        <w:t>3. It solves Model 3's flaw by using a 'Fourier Feature Embedding' on the second half of the network. This mathematically maps the data into sines and cosines, giving the network the exact tools it needs to capture the high-frequency ripples.</w:t>
+      </w:r>
+    </w:p>
+    <w:p>
+      <w:pPr>
+        <w:pStyle w:val="Heading1"/>
+      </w:pPr>
+      <w:r>
+        <w:t>4. The Input and Output Flow</w:t>
       </w:r>
     </w:p>
     <w:p>
@@ -112,17 +187,31 @@
         <w:rPr>
           <w:b/>
         </w:rPr>
-        <w:t>Why reconstruct from Time and Voltage? (Why not use other parameters?)</w:t>
+        <w:t>Feature Selection: Why use Timestamp (Time) as an input? (And why not other features?)</w:t>
         <w:br/>
       </w:r>
       <w:r>
-        <w:t>It is critical that we use Time and Voltage to 'build' the current from scratch, rather than using the Raw Current as an input. Here is why:</w:t>
+        <w:t>It is critical that we use true Time (Timestamp) and Voltage to 'build' the current from scratch. Here is why we specifically chose Time, and rejected other features:</w:t>
         <w:br/>
-        <w:t>1. Voltage is the 'Cause': In physics, voltage is the driving force that creates current. By starting with the cause, we force the AI to use the laws of physics to determine the effect.</w:t>
         <w:br/>
-        <w:t>2. Why not use Current as an input?: If we fed the raw, noisy Current into the AI as an input, the AI would take the lazy route. It would just perfectly copy the input to the output (a 1:1 mapping) without learning any physics at all. By hiding the raw current from the input layer and only using it at the very end to grade the AI, we force the AI to genuinely untangle the signal.</w:t>
+        <w:t>1. Why Time (Timestamp) is required for Physics:</w:t>
         <w:br/>
-        <w:t>3. Why not use Speed or Position?: We don't have those sensors! The entire point of this project is 'sensorless' counting. Since we only have a voltage and current sensor, we must rely exclusively on those two variables.</w:t>
+        <w:t xml:space="preserve">   Time (t) is the fundamental independent variable of all physics. The motor's inductor equation (V = L * di/dt) literally calculates the rate of change of current over Time. If we used a simple 'Data Index' (0, 1, 2, 3...) instead of the true Timestamp (e.g., 0.001s, 0.002s), the math for the derivative (di/dt) would completely break, and the physics equations would fail.</w:t>
+        <w:br/>
+        <w:br/>
+        <w:t>2. Why not use Previous Current (i_t-1)?:</w:t>
+        <w:br/>
+        <w:t xml:space="preserve">   If we feed the AI the previous noisy current to predict the next current, the AI will 'cheat'. It will just perfectly copy the noisy input to the output (a 1:1 mapping) without learning any physics at all. By hiding the raw current from the input layer entirely, we force the AI to genuinely calculate the physics from scratch.</w:t>
+        <w:br/>
+        <w:br/>
+        <w:t>3. Voltage is the 'Cause':</w:t>
+        <w:br/>
+        <w:t xml:space="preserve">   In physics, voltage is the driving force that creates current. By starting with the cause (Voltage over Time), we force the AI to determine the effect.</w:t>
+        <w:br/>
+        <w:br/>
+        <w:t>4. Why not use Speed or Position?:</w:t>
+        <w:br/>
+        <w:t xml:space="preserve">   We don't have those sensors! The entire point of this project is 'sensorless' counting. We must rely exclusively on Time and Voltage.</w:t>
       </w:r>
     </w:p>
     <w:p>
@@ -130,26 +219,7 @@
         <w:pStyle w:val="Heading1"/>
       </w:pPr>
       <w:r>
-        <w:t>3. Is the Neural Network Labeled? (Self-Supervised)</w:t>
-      </w:r>
-    </w:p>
-    <w:p>
-      <w:r>
-        <w:rPr>
-          <w:b/>
-        </w:rPr>
-        <w:t xml:space="preserve">No Human Labels Needed: </w:t>
-      </w:r>
-      <w:r>
-        <w:t>A very common question is 'What labels are we using to train the AI?' The beauty of this approach is that we do NOT use human labels. You don't need to manually click and label where the ripples are. Instead, the model is 'Self-Supervised' using the laws of physics. The AI takes the Time and Voltage, guesses the Current, and checks its own work against the raw sensor Current from the Excel file. Because it is mathematically restricted by the motor's physics, it is forced to organically separate the ripples in order to make its math match the raw sensor data.</w:t>
-      </w:r>
-    </w:p>
-    <w:p>
-      <w:pPr>
-        <w:pStyle w:val="Heading1"/>
-      </w:pPr>
-      <w:r>
-        <w:t>4. The Output (Decomposition)</w:t>
+        <w:t>5. The Output (Decomposition)</w:t>
       </w:r>
     </w:p>
     <w:p>
@@ -198,7 +268,7 @@
         <w:pStyle w:val="Heading1"/>
       </w:pPr>
       <w:r>
-        <w:t>5. How the AI Knows to Draw the 'Envelope'</w:t>
+        <w:t>6. How the AI Knows to Draw the 'Envelope'</w:t>
       </w:r>
     </w:p>
     <w:p>
@@ -258,7 +328,7 @@
         <w:pStyle w:val="Heading1"/>
       </w:pPr>
       <w:r>
-        <w:t>6. How to Get the Final Ripple Count</w:t>
+        <w:t>7. How to Get the Final Ripple Count</w:t>
       </w:r>
     </w:p>
     <w:p>
@@ -307,7 +377,7 @@
         <w:pStyle w:val="Heading1"/>
       </w:pPr>
       <w:r>
-        <w:t>7. The Grader: The Math Behind the Learning</w:t>
+        <w:t>8. The Grader: The Math Behind the Learning</w:t>
       </w:r>
     </w:p>
     <w:p>

</xml_diff>

<commit_message>
Update Alternatives section to focus purely on PINN variants
</commit_message>
<xml_diff>
--- a/PINN_Approach_Layman.docx
+++ b/PINN_Approach_Layman.docx
@@ -36,12 +36,12 @@
         <w:pStyle w:val="Heading1"/>
       </w:pPr>
       <w:r>
-        <w:t>2. Alternative Models Considered (For Discussion)</w:t>
+        <w:t>2. Alternative PINN Architectures Considered (For Discussion)</w:t>
       </w:r>
     </w:p>
     <w:p>
       <w:r>
-        <w:t>Before arriving at our final solution, we considered several other approaches for this task. Here is why they were rejected:</w:t>
+        <w:t>Before arriving at the 'Hybrid Fourier PINN', we considered several other Physics-Informed Neural Network (PINN) architectures for this task. Here is why they were rejected:</w:t>
         <w:br/>
         <w:br/>
       </w:r>
@@ -49,13 +49,13 @@
         <w:rPr>
           <w:b/>
         </w:rPr>
-        <w:t>Model 1: Traditional DSP Filters (e.g., Bandpass / Highpass)</w:t>
+        <w:t>Model 1: Standard Single-Head PINN</w:t>
         <w:br/>
       </w:r>
       <w:r>
-        <w:t>- How it works: Attempts to block low frequencies (the baseline) and only let high frequencies (the ripples) pass through.</w:t>
+        <w:t>- How it works: A standard Neural Network with a single output (Current). It uses the motor physics equation to guide its learning.</w:t>
         <w:br/>
-        <w:t>- Why it fails: During motor startup, the current surges incredibly fast. This massive transient spike contains high-frequency energy. A traditional filter gets confused, cannot distinguish the startup spike from a commutator ripple, and triggers dozens of fake ripple counts.</w:t>
+        <w:t>- Why it fails (Spectral Bias): Standard Neural Networks physically struggle to learn high-frequency, jagged shapes. If you use a single standard PINN, it will learn the massive, smooth motor startup curve perfectly, but it will completely blur out and ignore the tiny, fast commutation ripples. You cannot extract counts from a blurred line.</w:t>
         <w:br/>
         <w:br/>
       </w:r>
@@ -63,13 +63,13 @@
         <w:rPr>
           <w:b/>
         </w:rPr>
-        <w:t>Model 2: Supervised Machine Learning (e.g., 1D-CNN or LSTM)</w:t>
+        <w:t>Model 2: Dual-Head PINN (Without Fourier Features)</w:t>
         <w:br/>
       </w:r>
       <w:r>
-        <w:t>- How it works: Feeds the raw current into a deep neural network that has been trained to find ripples based on examples.</w:t>
+        <w:t>- How it works: A network with two outputs (Baseline and Ripple) to try and untangle the signal, but using standard Neural Network math for both heads.</w:t>
         <w:br/>
-        <w:t>- Why it fails: Supervised ML requires thousands of hours of manual human labeling ('Ground Truth'). Because the ripples are buried in noise, humans physically cannot label them accurately by eye. The model would be trained on bad data.</w:t>
+        <w:t>- Why it fails: Even with two outputs, standard Neural Networks still suffer from Spectral Bias. Output 1 will learn the Baseline, but Output 2 will just output flat, useless noise because the math fundamentally lacks the capability to easily mimic high-frequency oscillations.</w:t>
         <w:br/>
         <w:br/>
       </w:r>
@@ -77,13 +77,13 @@
         <w:rPr>
           <w:b/>
         </w:rPr>
-        <w:t>Model 3: Standard PINN (Without Fourier Features)</w:t>
+        <w:t>Model 3: PINN with Pre-Filtered Data</w:t>
         <w:br/>
       </w:r>
       <w:r>
-        <w:t>- How it works: Uses physics equations to guide a standard Neural Network.</w:t>
+        <w:t>- How it works: Running the Excel data through a high-pass DSP filter first, and then feeding that altered data into a PINN.</w:t>
         <w:br/>
-        <w:t>- Why it fails: Neural networks suffer from 'Spectral Bias' - they physically struggle to learn high-frequency, jagged shapes. A standard PINN will learn the smooth motor startup perfectly but will completely blur out the fast commutation ripples.</w:t>
+        <w:t>- Why it fails: A PINN relies on the fundamental laws of physics (V = L * di/dt + Ri + E). This physical equation only holds true for raw, real-world data. If you artificially filter the data before feeding it to the PINN, you destroy the physical relationship between Voltage and Current, and the PINN's physics math will completely fail.</w:t>
         <w:br/>
       </w:r>
     </w:p>
@@ -97,13 +97,11 @@
     </w:p>
     <w:p>
       <w:r>
-        <w:t>The Hybrid Fourier PINN specifically addresses the critical flaws of every other method:</w:t>
+        <w:t>The Hybrid Fourier PINN specifically addresses the critical flaws of standard PINN approaches:</w:t>
         <w:br/>
-        <w:t>1. It solves Model 1's flaw by using actual Motor Physics (instead of dumb frequency cutoffs) to perfectly understand and ignore the massive startup spikes.</w:t>
+        <w:t>1. It uses a Dual-Head structure to mathematically separate the problem into two distinct tasks (Baseline vs Ripples).</w:t>
         <w:br/>
-        <w:t>2. It solves Model 2's flaw by being 'Self-Supervised'. Because it uses physics to grade its own work, it requires zero manual human labels.</w:t>
-        <w:br/>
-        <w:t>3. It solves Model 3's flaw by using a 'Fourier Feature Embedding' on the second half of the network. This mathematically maps the data into sines and cosines, giving the network the exact tools it needs to capture the high-frequency ripples.</w:t>
+        <w:t>2. Most importantly, it applies a 'Fourier Feature Embedding' on the Ripple Head. This mathematically maps the Time input into high-frequency sines and cosines. This gives the second half of the network the exact mathematical tools it needs to overcome Spectral Bias and perfectly capture the high-frequency commutation ripples.</w:t>
       </w:r>
     </w:p>
     <w:p>
@@ -219,7 +217,26 @@
         <w:pStyle w:val="Heading1"/>
       </w:pPr>
       <w:r>
-        <w:t>5. The Output (Decomposition)</w:t>
+        <w:t>5. Is the Neural Network Labeled? (Self-Supervised)</w:t>
+      </w:r>
+    </w:p>
+    <w:p>
+      <w:r>
+        <w:rPr>
+          <w:b/>
+        </w:rPr>
+        <w:t xml:space="preserve">No Human Labels Needed: </w:t>
+      </w:r>
+      <w:r>
+        <w:t>A very common question is 'What labels are we using to train the AI?' The beauty of this approach is that we do NOT use human labels. You don't need to manually click and label where the ripples are. Instead, the model is 'Self-Supervised' using the laws of physics. The AI takes the Time and Voltage, guesses the Current, and checks its own work against the raw sensor Current from the Excel file. Because it is mathematically restricted by the motor's physics, it is forced to organically separate the ripples in order to make its math match the raw sensor data.</w:t>
+      </w:r>
+    </w:p>
+    <w:p>
+      <w:pPr>
+        <w:pStyle w:val="Heading1"/>
+      </w:pPr>
+      <w:r>
+        <w:t>6. The Output (Decomposition)</w:t>
       </w:r>
     </w:p>
     <w:p>
@@ -268,7 +285,7 @@
         <w:pStyle w:val="Heading1"/>
       </w:pPr>
       <w:r>
-        <w:t>6. How the AI Knows to Draw the 'Envelope'</w:t>
+        <w:t>7. How the AI Knows to Draw the 'Envelope'</w:t>
       </w:r>
     </w:p>
     <w:p>
@@ -328,7 +345,7 @@
         <w:pStyle w:val="Heading1"/>
       </w:pPr>
       <w:r>
-        <w:t>7. How to Get the Final Ripple Count</w:t>
+        <w:t>8. How to Get the Final Ripple Count</w:t>
       </w:r>
     </w:p>
     <w:p>
@@ -377,7 +394,7 @@
         <w:pStyle w:val="Heading1"/>
       </w:pPr>
       <w:r>
-        <w:t>8. The Grader: The Math Behind the Learning</w:t>
+        <w:t>9. The Grader: The Math Behind the Learning</w:t>
       </w:r>
     </w:p>
     <w:p>

</xml_diff>

<commit_message>
Add highly contextual justification for Point-by-Point MLP vs Windowed LSTM to Layman doc
</commit_message>
<xml_diff>
--- a/PINN_Approach_Layman.docx
+++ b/PINN_Approach_Layman.docx
@@ -173,11 +173,21 @@
         <w:rPr>
           <w:b/>
         </w:rPr>
-        <w:t>How the wave reconstruction works:</w:t>
+        <w:t>Why a Point-by-Point MLP? (Why NOT LSTMs or Windowed Data for this specific use case?)</w:t>
         <w:br/>
       </w:r>
       <w:r>
-        <w:t>We don't feed the entire waveform into the AI all at once. Instead, we feed it point-by-point. For a specific instant in time (e.g., t = 0.5s), we feed the AI that Time and the Voltage at that exact instant. The AI calculates and outputs the Current for that single instant. By repeating this process thousands of times across the timeline, the AI plots points that completely reconstruct the continuous current wave from scratch. It then combines the Baseline and the Ripple outputs to see if its 'reconstructed' wave matches the real Excel sensor data.</w:t>
+        <w:t>In standard AI (like LSTMs or Transformers), you feed the AI a 'window' of past data (e.g., the last 50 points of current) so it can spot trends. For our specific use case (Ripple Counting), using a window of data is a terrible idea for two critical reasons:</w:t>
+        <w:br/>
+        <w:br/>
+        <w:t>1. The Micro vs Macro Problem:</w:t>
+        <w:br/>
+        <w:t>During motor startup, the current surges upward massively. If you feed an LSTM a 'window' of the last 50 points, all it sees is a massive upward trend. The tiny 0.1 Amp commutation ripple is completely invisible because the 10 Amp startup surge overwhelms the window. The AI just predicts 'the trend goes up' and completely misses the ripples.</w:t>
+        <w:br/>
+        <w:br/>
+        <w:t>2. Physics Enforcement requires Point-by-Point:</w:t>
+        <w:br/>
+        <w:t>By using a strict Point-by-Point MLP, we strip the AI's ability to 'look at the trend'. We force it to look only at the Voltage at one specific microsecond, and use the strict laws of physics (V = L(di/dt) + Ri + E) to calculate what the current SHOULD be at that exact microsecond. Because we force it to look at the pure physics point-by-point, it mathematically has to draw the smooth macroscopic curve into Output 1. To make its final answer match the real-world sensor data, it is forced to dump all the tiny, remaining microscopic ripples into Output 2.</w:t>
         <w:br/>
         <w:br/>
       </w:r>

</xml_diff>

<commit_message>
Consolidate proposal into a single Layman doc comparing the Physics PINN and Signal Decomposition Network side-by-side
</commit_message>
<xml_diff>
--- a/PINN_Approach_Layman.docx
+++ b/PINN_Approach_Layman.docx
@@ -8,7 +8,7 @@
         <w:jc w:val="center"/>
       </w:pPr>
       <w:r>
-        <w:t>Understanding the PINN Approach for Ripple Counting</w:t>
+        <w:t>Architecture Proposals: Deep Learning for Ripple Counting</w:t>
       </w:r>
     </w:p>
     <w:p>
@@ -16,7 +16,7 @@
         <w:pStyle w:val="Heading1"/>
       </w:pPr>
       <w:r>
-        <w:t>1. The Goal: Finding the Ripples</w:t>
+        <w:t>1. The Core Problem</w:t>
       </w:r>
     </w:p>
     <w:p>
@@ -28,232 +28,7 @@
         <w:t>2. The Ripples: Tiny, repetitive waves that happen every time the motor's internal brushes hit a new copper pad. By counting these tiny waves, we know exactly how far the motor has turned.</w:t>
         <w:br/>
         <w:br/>
-        <w:t>The problem? When the motor starts up, the huge spike in the "Baseline" power completely buries the tiny "Ripples." We need a way to mathematically untangle them so we can count the ripples cleanly.</w:t>
-      </w:r>
-    </w:p>
-    <w:p>
-      <w:pPr>
-        <w:pStyle w:val="Heading1"/>
-      </w:pPr>
-      <w:r>
-        <w:t>2. Alternative PINN Architectures Considered (For Discussion)</w:t>
-      </w:r>
-    </w:p>
-    <w:p>
-      <w:r>
-        <w:t>Before arriving at the 'Hybrid Fourier PINN', we systematically evaluated three other PINN configurations. Here is exactly why each one failed:</w:t>
-        <w:br/>
-        <w:br/>
-      </w:r>
-      <w:r>
-        <w:rPr>
-          <w:b/>
-        </w:rPr>
-        <w:t>Model 1: Vanilla PINN (Single Head, No Fourier Features)</w:t>
-        <w:br/>
-      </w:r>
-      <w:r>
-        <w:t>- How it works: A standard PINN with a single output (Total Current).</w:t>
-        <w:br/>
-        <w:t>- Why it fails (Spectral Bias): Standard Neural Networks fundamentally struggle to learn high-frequency oscillations. A Vanilla PINN will perfectly learn the massive, smooth startup curve of the motor, but it will completely blur out and ignore the tiny, fast commutation ripples. You cannot extract counts from a completely blurred line.</w:t>
-        <w:br/>
-        <w:br/>
-      </w:r>
-      <w:r>
-        <w:rPr>
-          <w:b/>
-        </w:rPr>
-        <w:t>Model 2: Hybrid PINN (Dual-Head, No Fourier Features)</w:t>
-        <w:br/>
-      </w:r>
-      <w:r>
-        <w:t>- How it works: A network split into two outputs (Baseline and Ripple) to try and untangle the signal, but using standard Neural Network layers for both heads.</w:t>
-        <w:br/>
-        <w:t>- Why it fails: Even with two dedicated outputs, standard Neural Networks still suffer from Spectral Bias. Output 1 will successfully learn the Baseline envelope, but Output 2 will fail to capture the fast ripples. Instead, Output 2 will either output flat noise or struggle to converge, because standard math layers lack the capacity to easily mimic high-frequency repeating waves.</w:t>
-        <w:br/>
-        <w:br/>
-      </w:r>
-      <w:r>
-        <w:rPr>
-          <w:b/>
-        </w:rPr>
-        <w:t>Model 3: Fourier PINN (Single Head, With Fourier Features)</w:t>
-        <w:br/>
-      </w:r>
-      <w:r>
-        <w:t>- How it works: A single-output PINN where we apply Fourier Feature Embedding (sines and cosines) to the entire network to fix the spectral bias.</w:t>
-        <w:br/>
-        <w:t>- Why it fails (Physics Corruption): If you give the *entire* network high-frequency Fourier math, the network tries to learn *everything* as a high-frequency wiggle. It will artificially inject ripples into the smooth baseline (overfitting the noise), which completely violates the fundamental physics of the inductor (which resists rapid changes). The physics equation fails, and the predictions become unstable garbage.</w:t>
-        <w:br/>
-      </w:r>
-    </w:p>
-    <w:p>
-      <w:pPr>
-        <w:pStyle w:val="Heading1"/>
-      </w:pPr>
-      <w:r>
-        <w:t>3. Why the Hybrid Fourier PINN is the Best Fit</w:t>
-      </w:r>
-    </w:p>
-    <w:p>
-      <w:r>
-        <w:t>The Hybrid Fourier PINN perfectly balances the strengths of all the previous models by isolating the Fourier math:</w:t>
-        <w:br/>
-        <w:t>1. We use a Dual-Head structure (Hybrid) to mathematically separate the Baseline from the Ripples.</w:t>
-        <w:br/>
-        <w:t>2. We apply Fourier Feature Embedding ONLY to the Ripple Head, leaving the Baseline Head as a standard, smooth network.</w:t>
-        <w:br/>
-        <w:t>This allows the Baseline Head to cleanly obey the slow motor physics, while giving the Ripple Head the exact mathematical tools (sines and cosines) it needs to capture the high-frequency commutation ripples without corrupting the baseline.</w:t>
-      </w:r>
-    </w:p>
-    <w:p>
-      <w:pPr>
-        <w:pStyle w:val="Heading1"/>
-      </w:pPr>
-      <w:r>
-        <w:t>4. The Input and Output Flow</w:t>
-      </w:r>
-    </w:p>
-    <w:p>
-      <w:r>
-        <w:drawing>
-          <wp:inline xmlns:a="http://schemas.openxmlformats.org/drawingml/2006/main" xmlns:pic="http://schemas.openxmlformats.org/drawingml/2006/picture">
-            <wp:extent cx="5486400" cy="2973334"/>
-            <wp:docPr id="1" name="Picture 1"/>
-            <wp:cNvGraphicFramePr>
-              <a:graphicFrameLocks noChangeAspect="1"/>
-            </wp:cNvGraphicFramePr>
-            <a:graphic>
-              <a:graphicData uri="http://schemas.openxmlformats.org/drawingml/2006/picture">
-                <pic:pic>
-                  <pic:nvPicPr>
-                    <pic:cNvPr id="0" name="pinn_viz_4.png"/>
-                    <pic:cNvPicPr/>
-                  </pic:nvPicPr>
-                  <pic:blipFill>
-                    <a:blip r:embed="rId9"/>
-                    <a:stretch>
-                      <a:fillRect/>
-                    </a:stretch>
-                  </pic:blipFill>
-                  <pic:spPr>
-                    <a:xfrm>
-                      <a:off x="0" y="0"/>
-                      <a:ext cx="5486400" cy="2973334"/>
-                    </a:xfrm>
-                    <a:prstGeom prst="rect"/>
-                  </pic:spPr>
-                </pic:pic>
-              </a:graphicData>
-            </a:graphic>
-          </wp:inline>
-        </w:drawing>
-      </w:r>
-    </w:p>
-    <w:p>
-      <w:r>
-        <w:rPr>
-          <w:b/>
-        </w:rPr>
-        <w:t>Explicit MLP Inputs and Outputs:</w:t>
-        <w:br/>
-      </w:r>
-      <w:r>
-        <w:t>The Multi-Layer Perceptron (MLP) acts as a mathematical function generator. At any given microsecond, it looks at exactly two input numbers and spits out exactly two output numbers.</w:t>
-        <w:br/>
-        <w:t>- MLP Inputs (2 Nodes): [Time, Voltage]</w:t>
-        <w:br/>
-        <w:t>- MLP Outputs (2 Nodes): [Baseline Current, Ripple Current]</w:t>
-        <w:br/>
-        <w:br/>
-      </w:r>
-    </w:p>
-    <w:p>
-      <w:r>
-        <w:rPr>
-          <w:b/>
-        </w:rPr>
-        <w:t>Why a Point-by-Point MLP? (Why NOT LSTMs or Windowed Data for this specific use case?)</w:t>
-        <w:br/>
-      </w:r>
-      <w:r>
-        <w:t>In standard AI (like LSTMs or Transformers), you feed the AI a 'window' of past data (e.g., the last 50 points of current) so it can spot trends. For our specific use case (Ripple Counting), using a window of data is a terrible idea for two critical reasons:</w:t>
-        <w:br/>
-        <w:br/>
-        <w:t>1. The Micro vs Macro Problem:</w:t>
-        <w:br/>
-        <w:t>During motor startup, the current surges upward massively. If you feed an LSTM a 'window' of the last 50 points, all it sees is a massive upward trend. The tiny 0.1 Amp commutation ripple is completely invisible because the 10 Amp startup surge overwhelms the window. The AI just predicts 'the trend goes up' and completely misses the ripples.</w:t>
-        <w:br/>
-        <w:br/>
-        <w:t>2. Physics Enforcement requires Point-by-Point:</w:t>
-        <w:br/>
-        <w:t>By using a strict Point-by-Point MLP, we strip the AI's ability to 'look at the trend'. We force it to look only at the Voltage at one specific microsecond, and use the strict laws of physics (V = L(di/dt) + Ri + E) to calculate what the current SHOULD be at that exact microsecond. Because we force it to look at the pure physics point-by-point, it mathematically has to draw the smooth macroscopic curve into Output 1. To make its final answer match the real-world sensor data, it is forced to dump all the tiny, remaining microscopic ripples into Output 2.</w:t>
-        <w:br/>
-        <w:br/>
-      </w:r>
-    </w:p>
-    <w:p>
-      <w:r>
-        <w:rPr>
-          <w:b/>
-        </w:rPr>
-        <w:t>Feature Selection: Why use Timestamp (Time) as an input? (And why not other features?)</w:t>
-        <w:br/>
-      </w:r>
-      <w:r>
-        <w:t>It is critical that we use true Time (Timestamp) and Voltage to 'build' the current from scratch. Here is why we specifically chose Time, and rejected other features:</w:t>
-        <w:br/>
-        <w:br/>
-        <w:t>1. Why Time (Timestamp) is required for Physics:</w:t>
-        <w:br/>
-        <w:t xml:space="preserve">   Time (t) is the fundamental independent variable of all physics. The motor's inductor equation (V = L * di/dt) literally calculates the rate of change of current over Time. If we used a simple 'Data Index' (0, 1, 2, 3...) instead of the true Timestamp (e.g., 0.001s, 0.002s), the math for the derivative (di/dt) would completely break, and the physics equations would fail.</w:t>
-        <w:br/>
-        <w:br/>
-        <w:t>2. Why not use Previous Current (i_t-1)?:</w:t>
-        <w:br/>
-        <w:t xml:space="preserve">   If we feed the AI the previous noisy current to predict the next current, the AI will 'cheat'. It will just perfectly copy the noisy input to the output (a 1:1 mapping) without learning any physics at all. By hiding the raw current from the input layer entirely, we force the AI to genuinely calculate the physics from scratch.</w:t>
-        <w:br/>
-        <w:br/>
-        <w:t>3. Voltage is the 'Cause':</w:t>
-        <w:br/>
-        <w:t xml:space="preserve">   In physics, voltage is the driving force that creates current. By starting with the cause (Voltage over Time), we force the AI to determine the effect.</w:t>
-        <w:br/>
-        <w:br/>
-        <w:t>4. Why not use Speed or Position?:</w:t>
-        <w:br/>
-        <w:t xml:space="preserve">   We don't have those sensors! The entire point of this project is 'sensorless' counting. We must rely exclusively on Time and Voltage.</w:t>
-      </w:r>
-    </w:p>
-    <w:p>
-      <w:pPr>
-        <w:pStyle w:val="Heading1"/>
-      </w:pPr>
-      <w:r>
-        <w:t>5. Is the Neural Network Labeled? (Self-Supervised)</w:t>
-      </w:r>
-    </w:p>
-    <w:p>
-      <w:r>
-        <w:rPr>
-          <w:b/>
-        </w:rPr>
-        <w:t xml:space="preserve">No Human Labels Needed: </w:t>
-      </w:r>
-      <w:r>
-        <w:t>A very common question is 'What labels are we using to train the AI?' The beauty of this approach is that we do NOT use human labels. You don't need to manually click and label where the ripples are. Instead, the model is 'Self-Supervised' using the laws of physics. The AI takes the Time and Voltage, guesses the Current, and checks its own work against the raw sensor Current from the Excel file. Because it is mathematically restricted by the motor's physics, it is forced to organically separate the ripples in order to make its math match the raw sensor data.</w:t>
-      </w:r>
-    </w:p>
-    <w:p>
-      <w:pPr>
-        <w:pStyle w:val="Heading1"/>
-      </w:pPr>
-      <w:r>
-        <w:t>6. The Output (Decomposition)</w:t>
-      </w:r>
-    </w:p>
-    <w:p>
-      <w:r>
-        <w:t>By designing the AI to have two separate outputs, we force it to literally untangle the signal for us. The AI is mathematically forced to make Output 1 perfectly smooth. As a result, it has no choice but to dump all the tiny, jagged commutation waves into Output 2.</w:t>
+        <w:t>The problem? When the motor starts up, the massive "Baseline" power completely buries the tiny "Ripples." We present two competing Deep Learning architectures designed to mathematically untangle the signal so we can count the ripples cleanly, without needing human-labeled training data.</w:t>
       </w:r>
     </w:p>
     <w:p>
@@ -261,7 +36,7 @@
         <w:drawing>
           <wp:inline xmlns:a="http://schemas.openxmlformats.org/drawingml/2006/main" xmlns:pic="http://schemas.openxmlformats.org/drawingml/2006/picture">
             <wp:extent cx="5486400" cy="2743200"/>
-            <wp:docPr id="2" name="Picture 2"/>
+            <wp:docPr id="1" name="Picture 1"/>
             <wp:cNvGraphicFramePr>
               <a:graphicFrameLocks noChangeAspect="1"/>
             </wp:cNvGraphicFramePr>
@@ -273,7 +48,7 @@
                     <pic:cNvPicPr/>
                   </pic:nvPicPr>
                   <pic:blipFill>
-                    <a:blip r:embed="rId10"/>
+                    <a:blip r:embed="rId9"/>
                     <a:stretch>
                       <a:fillRect/>
                     </a:stretch>
@@ -297,7 +72,7 @@
         <w:pStyle w:val="Heading1"/>
       </w:pPr>
       <w:r>
-        <w:t>7. How the AI Knows to Draw the 'Envelope'</w:t>
+        <w:t>2. Proposal A: Physics-Informed Neural Network (ODE PINN)</w:t>
       </w:r>
     </w:p>
     <w:p>
@@ -305,51 +80,68 @@
         <w:rPr>
           <w:b/>
         </w:rPr>
-        <w:t>A common question is: How does the AI know to draw the curved 'envelope' instead of just drawing the jagged ripples into Output 1?</w:t>
+        <w:t xml:space="preserve">Model Architecture: </w:t>
+      </w:r>
+      <w:r>
+        <w:t>Hybrid Fourier Multi-Layer Perceptron (Point-by-Point)</w:t>
+        <w:br/>
+      </w:r>
+      <w:r>
+        <w:rPr>
+          <w:b/>
+        </w:rPr>
+        <w:t xml:space="preserve">Inputs: </w:t>
+      </w:r>
+      <w:r>
+        <w:t>Time (t), Voltage (V)</w:t>
+        <w:br/>
+      </w:r>
+      <w:r>
+        <w:rPr>
+          <w:b/>
+        </w:rPr>
+        <w:t xml:space="preserve">Outputs: </w:t>
+      </w:r>
+      <w:r>
+        <w:t>Baseline Current b(t), Ripple Current r(t)</w:t>
         <w:br/>
         <w:br/>
       </w:r>
       <w:r>
-        <w:t>The answer lies entirely in the physics of the motor's Inductor (the copper coils). In physics, an inductor acts like a heavy flywheel - it physically resists rapid, sudden changes in current. Because we force Output 1 to obey the motor's electrical equation (V = L(di/dt) + Ri + E), the AI is heavily penalized if it tries to draw fast, jagged wiggles into the Baseline. If it tries to put ripples into the Baseline, the math for the inductor explodes, and the AI fails its test.</w:t>
+        <w:rPr>
+          <w:b/>
+        </w:rPr>
+        <w:t>How it works (The Physics Math):</w:t>
+        <w:br/>
+      </w:r>
+      <w:r>
+        <w:t>This model doesn't look at the noisy current at all. Instead, it takes the Voltage and uses fundamental electrical physics (V = L(di/dt) + Ri + E) to calculate what the current SHOULD be. Because this physics equation governs massive inductors, it is mathematically incapable of drawing tiny, fast ripples. The AI is forced to draw a perfectly smooth baseline curve. To make its final answer match the real sensor data, it must dump all the unexplained ripples into its second output.</w:t>
         <w:br/>
         <w:br/>
-        <w:t>Because the AI is mathematically forced to obey the heavy, slow-moving physics of the inductor, it is physically impossible for it to draw the fast, jagged ripples. It is strictly forced to draw the smoothest possible curve that traces the massive power surges of the motor turning on and off (the envelope). To make its final math match your Excel file, it has no choice but to take all the fast, jagged ripples that it wasn't allowed to draw, and dump them into Output 2 (the Ripple output).</w:t>
       </w:r>
-    </w:p>
-    <w:p>
       <w:r>
-        <w:drawing>
-          <wp:inline xmlns:a="http://schemas.openxmlformats.org/drawingml/2006/main" xmlns:pic="http://schemas.openxmlformats.org/drawingml/2006/picture">
-            <wp:extent cx="5486400" cy="2743200"/>
-            <wp:docPr id="3" name="Picture 3"/>
-            <wp:cNvGraphicFramePr>
-              <a:graphicFrameLocks noChangeAspect="1"/>
-            </wp:cNvGraphicFramePr>
-            <a:graphic>
-              <a:graphicData uri="http://schemas.openxmlformats.org/drawingml/2006/picture">
-                <pic:pic>
-                  <pic:nvPicPr>
-                    <pic:cNvPr id="0" name="pinn_viz_3.png"/>
-                    <pic:cNvPicPr/>
-                  </pic:nvPicPr>
-                  <pic:blipFill>
-                    <a:blip r:embed="rId11"/>
-                    <a:stretch>
-                      <a:fillRect/>
-                    </a:stretch>
-                  </pic:blipFill>
-                  <pic:spPr>
-                    <a:xfrm>
-                      <a:off x="0" y="0"/>
-                      <a:ext cx="5486400" cy="2743200"/>
-                    </a:xfrm>
-                    <a:prstGeom prst="rect"/>
-                  </pic:spPr>
-                </pic:pic>
-              </a:graphicData>
-            </a:graphic>
-          </wp:inline>
-        </w:drawing>
+        <w:rPr>
+          <w:b/>
+        </w:rPr>
+        <w:t>Input Justification (Why Time and Voltage?):</w:t>
+        <w:br/>
+      </w:r>
+      <w:r>
+        <w:t>We use 'Point-by-Point' Time instead of a window of data because physics requires taking the derivative of time (di/dt). We use Voltage because it is the 'Cause'. If we fed the network the raw noisy Current, it would 'cheat' and just output the noise 1:1 without learning any physics.</w:t>
+        <w:br/>
+        <w:br/>
+      </w:r>
+      <w:r>
+        <w:rPr>
+          <w:b/>
+        </w:rPr>
+        <w:t>Pros &amp; Cons:</w:t>
+        <w:br/>
+      </w:r>
+      <w:r>
+        <w:t>- PRO: Grounded in absolute physical truth. Highly robust to unexpected noise.</w:t>
+        <w:br/>
+        <w:t>- CON: Motor-specific. The equation relies on knowing Motor Inductance (L) and Resistance (R). If you switch to a totally different type of motor, the physics equation breaks.</w:t>
       </w:r>
     </w:p>
     <w:p>
@@ -357,12 +149,89 @@
         <w:pStyle w:val="Heading1"/>
       </w:pPr>
       <w:r>
-        <w:t>8. How to Get the Final Ripple Count</w:t>
+        <w:t>3. Proposal B: Structured Signal Decomposition Network</w:t>
       </w:r>
     </w:p>
     <w:p>
       <w:r>
-        <w:t>Once the AI finishes untangling the signal, getting the final ripple count is incredibly simple. We completely throw away the Baseline output (Output 1). We take the perfectly isolated Ripple output (Output 2) and run a standard peak-counting algorithm on it. Because the signal is now perfectly clean and hovering around zero, every single peak is a guaranteed commutator ripple.</w:t>
+        <w:rPr>
+          <w:b/>
+        </w:rPr>
+        <w:t xml:space="preserve">Model Architecture: </w:t>
+      </w:r>
+      <w:r>
+        <w:t>1D-CNN (Convolutional Neural Network) taking rolling windows of data.</w:t>
+        <w:br/>
+      </w:r>
+      <w:r>
+        <w:rPr>
+          <w:b/>
+        </w:rPr>
+        <w:t xml:space="preserve">Inputs: </w:t>
+      </w:r>
+      <w:r>
+        <w:t>Measured Current I(t), Voltage V(t) [Rolling Window]</w:t>
+        <w:br/>
+      </w:r>
+      <w:r>
+        <w:rPr>
+          <w:b/>
+        </w:rPr>
+        <w:t xml:space="preserve">Outputs: </w:t>
+      </w:r>
+      <w:r>
+        <w:t>Denoised Ripple, Smooth Baseline, Amplitude A(t), Instantaneous Frequency, Confidence Score</w:t>
+        <w:br/>
+        <w:br/>
+      </w:r>
+      <w:r>
+        <w:rPr>
+          <w:b/>
+        </w:rPr>
+        <w:t>How it works (The Signal Math):</w:t>
+        <w:br/>
+      </w:r>
+      <w:r>
+        <w:t>Instead of using electrical physics, this model uses a universal signal equation: i(t) = b(t) + A(t)*q(t) + noise. It acknowledges that any brushed DC motor current is just a smooth baseline b(t) combined with a quasi-periodic ripple q(t) that changes amplitude A(t) based on the motor's load. The network looks at a rolling window of the raw current and learns to extract these specific mathematical components.</w:t>
+        <w:br/>
+        <w:br/>
+      </w:r>
+      <w:r>
+        <w:rPr>
+          <w:b/>
+        </w:rPr>
+        <w:t>Input/Output Justification:</w:t>
+        <w:br/>
+      </w:r>
+      <w:r>
+        <w:t>We input the raw measured Current because this model doesn't care about the internal circuitry of the motor, it only cares about the signal shapes. We specifically output 'Amplitude' and 'Instantaneous Frequency' because in the real world, ripple size and frequency change constantly as the motor speeds up or encounters resistance. Crucially, we output a 'Confidence Score'. If a massive unexpected spike hits the motor, the network can flag 'Low Confidence', telling the system to pause counting.</w:t>
+        <w:br/>
+        <w:br/>
+      </w:r>
+      <w:r>
+        <w:rPr>
+          <w:b/>
+        </w:rPr>
+        <w:t>Pros &amp; Cons:</w:t>
+        <w:br/>
+      </w:r>
+      <w:r>
+        <w:t>- PRO: Motor Agnostic. It works on any brushed DC motor because it doesn't rely on specific L or R values. Highly practical for real-world deployment due to confidence metrics.</w:t>
+        <w:br/>
+        <w:t>- CON: Requires careful loss function design to ensure it doesn't accidentally categorize the startup surge as a massive ripple.</w:t>
+      </w:r>
+    </w:p>
+    <w:p>
+      <w:pPr>
+        <w:pStyle w:val="Heading1"/>
+      </w:pPr>
+      <w:r>
+        <w:t>4. Final Ripple Counting (Shared by Both)</w:t>
+      </w:r>
+    </w:p>
+    <w:p>
+      <w:r>
+        <w:t>Regardless of which model is chosen to do the untangling, the final step is incredibly simple. We discard the baseline outputs entirely, and run a standard peak-detection algorithm on the isolated Ripple output. Because the signal has been perfectly separated from the startup surges and centered around zero, every peak is a guaranteed commutator crossing.</w:t>
       </w:r>
     </w:p>
     <w:p>
@@ -370,7 +239,7 @@
         <w:drawing>
           <wp:inline xmlns:a="http://schemas.openxmlformats.org/drawingml/2006/main" xmlns:pic="http://schemas.openxmlformats.org/drawingml/2006/picture">
             <wp:extent cx="5486400" cy="2057400"/>
-            <wp:docPr id="4" name="Picture 4"/>
+            <wp:docPr id="2" name="Picture 2"/>
             <wp:cNvGraphicFramePr>
               <a:graphicFrameLocks noChangeAspect="1"/>
             </wp:cNvGraphicFramePr>
@@ -382,7 +251,7 @@
                     <pic:cNvPicPr/>
                   </pic:nvPicPr>
                   <pic:blipFill>
-                    <a:blip r:embed="rId12"/>
+                    <a:blip r:embed="rId10"/>
                     <a:stretch>
                       <a:fillRect/>
                     </a:stretch>
@@ -399,72 +268,6 @@
             </a:graphic>
           </wp:inline>
         </w:drawing>
-      </w:r>
-    </w:p>
-    <w:p>
-      <w:pPr>
-        <w:pStyle w:val="Heading1"/>
-      </w:pPr>
-      <w:r>
-        <w:t>9. The Grader: The Math Behind the Learning</w:t>
-      </w:r>
-    </w:p>
-    <w:p>
-      <w:r>
-        <w:rPr>
-          <w:b/>
-        </w:rPr>
-        <w:t xml:space="preserve">Feature Used: </w:t>
-      </w:r>
-      <w:r>
-        <w:t>The actual measured Current from your Excel sensor data is used exclusively in the Loss Function (the AI's grading rubric). It is NEVER used as an input.</w:t>
-      </w:r>
-    </w:p>
-    <w:p>
-      <w:r>
-        <w:rPr>
-          <w:b/>
-        </w:rPr>
-        <w:t xml:space="preserve">The Exact Loss Function: </w:t>
-      </w:r>
-      <w:r>
-        <w:t>The network is trained by minimizing a composite loss function made of three distinct parts:</w:t>
-        <w:br/>
-        <w:br/>
-        <w:t>Total Loss = (?_data * Data_Loss) + (?_physics * Physics_Loss) + (?_smooth * Smoothness_Loss)</w:t>
-        <w:br/>
-        <w:br/>
-      </w:r>
-      <w:r>
-        <w:rPr>
-          <w:b/>
-        </w:rPr>
-        <w:t xml:space="preserve">1. Data Loss (Mean Squared Error): </w:t>
-      </w:r>
-      <w:r>
-        <w:t>This measures how far off the AI's total guess is from reality. The AI adds its Baseline guess and its Ripple guess together, and compares it against the true measured Current from the Excel file. If the sum doesn't perfectly match the real sensor data, the AI is heavily penalized.</w:t>
-        <w:br/>
-        <w:br/>
-      </w:r>
-      <w:r>
-        <w:rPr>
-          <w:b/>
-        </w:rPr>
-        <w:t xml:space="preserve">2. Physics Loss (ODE Constraint): </w:t>
-      </w:r>
-      <w:r>
-        <w:t>As shown in the envelope section, we use automatic differentiation (autograd) to calculate the derivative of the AI's Baseline guess with respect to time (di/dt). We then plug this into the fundamental motor circuit differential equation. If the AI's Baseline guess does not perfectly balance this equation, it is penalized. This forces the Baseline output to strictly obey the laws of physics.</w:t>
-        <w:br/>
-        <w:br/>
-      </w:r>
-      <w:r>
-        <w:rPr>
-          <w:b/>
-        </w:rPr>
-        <w:t xml:space="preserve">3. Smoothness Loss: </w:t>
-      </w:r>
-      <w:r>
-        <w:t>A small mathematical penalty applied only to the Baseline output that penalizes high-frequency changes. Because the Baseline is mathematically forced to be perfectly smooth by both the Physics Loss and the Smoothness Loss, the AI has no choice but to dump all the tiny, jagged commutation waves into the 'Ripple' output to satisfy the Data Loss. This organic struggle perfectly untangles the signal.</w:t>
       </w:r>
     </w:p>
     <w:sectPr>

</xml_diff>

<commit_message>
Update proposal to strictly compare two mathematical constraint approaches for the SAME Hybrid Fourier Inverse PINN architecture
</commit_message>
<xml_diff>
--- a/PINN_Approach_Layman.docx
+++ b/PINN_Approach_Layman.docx
@@ -8,7 +8,7 @@
         <w:jc w:val="center"/>
       </w:pPr>
       <w:r>
-        <w:t>Architecture Proposals: Deep Learning for Ripple Counting</w:t>
+        <w:t>Architecture Proposals: Hybrid Fourier Inverse PINN Approaches</w:t>
       </w:r>
     </w:p>
     <w:p>
@@ -16,19 +16,15 @@
         <w:pStyle w:val="Heading1"/>
       </w:pPr>
       <w:r>
-        <w:t>1. The Core Problem</w:t>
+        <w:t>1. The Core Architecture (Shared by both models)</w:t>
       </w:r>
     </w:p>
     <w:p>
       <w:r>
-        <w:t>When a motor runs, the electrical current it uses isn't perfectly smooth. It has two main parts mixed together:</w:t>
-        <w:br/>
-        <w:t>1. The Baseline: The massive amount of power the motor needs just to spin (this spikes heavily when you first turn the motor on or hit the brakes).</w:t>
-        <w:br/>
-        <w:t>2. The Ripples: Tiny, repetitive waves that happen every time the motor's internal brushes hit a new copper pad. By counting these tiny waves, we know exactly how far the motor has turned.</w:t>
+        <w:t>For this project, we are strictly utilizing a Hybrid Fourier Inverse Physics-Informed Neural Network (PINN). Unlike standard AI that looks at a window of data to guess a trend, our PINN operates Point-by-Point. It takes a specific microsecond in Time (t) and uses strict mathematical constraints to physically untangle the massive motor startup surge (the Baseline) from the tiny commutation waves (the Ripples).</w:t>
         <w:br/>
         <w:br/>
-        <w:t>The problem? When the motor starts up, the massive "Baseline" power completely buries the tiny "Ripples." We present two competing Deep Learning architectures designed to mathematically untangle the signal so we can count the ripples cleanly, without needing human-labeled training data.</w:t>
+        <w:t>While both models use the exact same Neural Network architecture (Dual-Head, Fourier features on the ripple head), they differ in the mathematical equation they use as their 'Loss Function' constraint to force the untangling.</w:t>
       </w:r>
     </w:p>
     <w:p>
@@ -72,7 +68,7 @@
         <w:pStyle w:val="Heading1"/>
       </w:pPr>
       <w:r>
-        <w:t>2. Proposal A: Physics-Informed Neural Network (ODE PINN)</w:t>
+        <w:t>2. Proposal A: The Electrical ODE PINN</w:t>
       </w:r>
     </w:p>
     <w:p>
@@ -80,10 +76,10 @@
         <w:rPr>
           <w:b/>
         </w:rPr>
-        <w:t xml:space="preserve">Model Architecture: </w:t>
+        <w:t xml:space="preserve">Model: </w:t>
       </w:r>
       <w:r>
-        <w:t>Hybrid Fourier Multi-Layer Perceptron (Point-by-Point)</w:t>
+        <w:t>Hybrid Fourier Inverse PINN</w:t>
         <w:br/>
       </w:r>
       <w:r>
@@ -111,88 +107,11 @@
         <w:rPr>
           <w:b/>
         </w:rPr>
-        <w:t>How it works (The Physics Math):</w:t>
+        <w:t>The Mathematical Constraint:</w:t>
         <w:br/>
       </w:r>
       <w:r>
-        <w:t>This model doesn't look at the noisy current at all. Instead, it takes the Voltage and uses fundamental electrical physics (V = L(di/dt) + Ri + E) to calculate what the current SHOULD be. Because this physics equation governs massive inductors, it is mathematically incapable of drawing tiny, fast ripples. The AI is forced to draw a perfectly smooth baseline curve. To make its final answer match the real sensor data, it must dump all the unexplained ripples into its second output.</w:t>
-        <w:br/>
-        <w:br/>
-      </w:r>
-      <w:r>
-        <w:rPr>
-          <w:b/>
-        </w:rPr>
-        <w:t>Input Justification (Why Time and Voltage?):</w:t>
-        <w:br/>
-      </w:r>
-      <w:r>
-        <w:t>We use 'Point-by-Point' Time instead of a window of data because physics requires taking the derivative of time (di/dt). We use Voltage because it is the 'Cause'. If we fed the network the raw noisy Current, it would 'cheat' and just output the noise 1:1 without learning any physics.</w:t>
-        <w:br/>
-        <w:br/>
-      </w:r>
-      <w:r>
-        <w:rPr>
-          <w:b/>
-        </w:rPr>
-        <w:t>Pros &amp; Cons:</w:t>
-        <w:br/>
-      </w:r>
-      <w:r>
-        <w:t>- PRO: Grounded in absolute physical truth. Highly robust to unexpected noise.</w:t>
-        <w:br/>
-        <w:t>- CON: Motor-specific. The equation relies on knowing Motor Inductance (L) and Resistance (R). If you switch to a totally different type of motor, the physics equation breaks.</w:t>
-      </w:r>
-    </w:p>
-    <w:p>
-      <w:pPr>
-        <w:pStyle w:val="Heading1"/>
-      </w:pPr>
-      <w:r>
-        <w:t>3. Proposal B: Structured Signal Decomposition Network</w:t>
-      </w:r>
-    </w:p>
-    <w:p>
-      <w:r>
-        <w:rPr>
-          <w:b/>
-        </w:rPr>
-        <w:t xml:space="preserve">Model Architecture: </w:t>
-      </w:r>
-      <w:r>
-        <w:t>1D-CNN (Convolutional Neural Network) taking rolling windows of data.</w:t>
-        <w:br/>
-      </w:r>
-      <w:r>
-        <w:rPr>
-          <w:b/>
-        </w:rPr>
-        <w:t xml:space="preserve">Inputs: </w:t>
-      </w:r>
-      <w:r>
-        <w:t>Measured Current I(t), Voltage V(t) [Rolling Window]</w:t>
-        <w:br/>
-      </w:r>
-      <w:r>
-        <w:rPr>
-          <w:b/>
-        </w:rPr>
-        <w:t xml:space="preserve">Outputs: </w:t>
-      </w:r>
-      <w:r>
-        <w:t>Denoised Ripple, Smooth Baseline, Amplitude A(t), Instantaneous Frequency, Confidence Score</w:t>
-        <w:br/>
-        <w:br/>
-      </w:r>
-      <w:r>
-        <w:rPr>
-          <w:b/>
-        </w:rPr>
-        <w:t>How it works (The Signal Math):</w:t>
-        <w:br/>
-      </w:r>
-      <w:r>
-        <w:t>Instead of using electrical physics, this model uses a universal signal equation: i(t) = b(t) + A(t)*q(t) + noise. It acknowledges that any brushed DC motor current is just a smooth baseline b(t) combined with a quasi-periodic ripple q(t) that changes amplitude A(t) based on the motor's load. The network looks at a rolling window of the raw current and learns to extract these specific mathematical components.</w:t>
+        <w:t>This model forces the baseline output to obey the fundamental electrical equation of the motor: V = L(di/dt) + Ri + E. Because this physics equation governs massive inductors, it is mathematically incapable of drawing tiny, fast ripples. To make its final answer match the real sensor data, the PINN is forced to dump all the unexplained ripples into its second output.</w:t>
         <w:br/>
         <w:br/>
       </w:r>
@@ -204,7 +123,46 @@
         <w:br/>
       </w:r>
       <w:r>
-        <w:t>We input the raw measured Current because this model doesn't care about the internal circuitry of the motor, it only cares about the signal shapes. We specifically output 'Amplitude' and 'Instantaneous Frequency' because in the real world, ripple size and frequency change constantly as the motor speeds up or encounters resistance. Crucially, we output a 'Confidence Score'. If a massive unexpected spike hits the motor, the network can flag 'Low Confidence', telling the system to pause counting.</w:t>
+        <w:t>We use Voltage because it is the electrical 'Cause', forcing the AI to calculate the Current 'Effect' from scratch without cheating. We use an Inverse PINN because the motor parameters (R, L, E) are unknown; the network discovers them dynamically during training.</w:t>
+      </w:r>
+    </w:p>
+    <w:p>
+      <w:pPr>
+        <w:pStyle w:val="Heading1"/>
+      </w:pPr>
+      <w:r>
+        <w:t>3. Proposal B: The Signal-Constrained PINN</w:t>
+      </w:r>
+    </w:p>
+    <w:p>
+      <w:r>
+        <w:rPr>
+          <w:b/>
+        </w:rPr>
+        <w:t xml:space="preserve">Model: </w:t>
+      </w:r>
+      <w:r>
+        <w:t>Hybrid Fourier Inverse PINN</w:t>
+        <w:br/>
+      </w:r>
+      <w:r>
+        <w:rPr>
+          <w:b/>
+        </w:rPr>
+        <w:t xml:space="preserve">Inputs: </w:t>
+      </w:r>
+      <w:r>
+        <w:t>Time (t), Voltage (V), optionally Speed/PWM</w:t>
+        <w:br/>
+      </w:r>
+      <w:r>
+        <w:rPr>
+          <w:b/>
+        </w:rPr>
+        <w:t xml:space="preserve">Outputs: </w:t>
+      </w:r>
+      <w:r>
+        <w:t>Baseline b(t), Ripple Phase q(t), Amplitude A(t), Instantaneous Freq, Confidence</w:t>
         <w:br/>
         <w:br/>
       </w:r>
@@ -212,13 +170,23 @@
         <w:rPr>
           <w:b/>
         </w:rPr>
-        <w:t>Pros &amp; Cons:</w:t>
+        <w:t>The Mathematical Constraint:</w:t>
         <w:br/>
       </w:r>
       <w:r>
-        <w:t>- PRO: Motor Agnostic. It works on any brushed DC motor because it doesn't rely on specific L or R values. Highly practical for real-world deployment due to confidence metrics.</w:t>
+        <w:t>Instead of the electrical circuit ODE, this model uses a structural signal equation: i(t) = b(t) + A(t)*q(t) + noise. It still uses the Dual-Head Fourier PINN architecture, but it constrains the second head to explicitly model Amplitude Modulation (A) and Phase (q). The baseline b(t) is still constrained to be smooth, but the ripple head is now mathematically forced to output a structured, periodic wave whose size (Amplitude) and speed (Frequency) change over time based on the motor load.</w:t>
         <w:br/>
-        <w:t>- CON: Requires careful loss function design to ensure it doesn't accidentally categorize the startup surge as a massive ripple.</w:t>
+        <w:br/>
+      </w:r>
+      <w:r>
+        <w:rPr>
+          <w:b/>
+        </w:rPr>
+        <w:t>Input/Output Justification:</w:t>
+        <w:br/>
+      </w:r>
+      <w:r>
+        <w:t>By explicitly outputting Amplitude and Instantaneous Frequency, this PINN accounts for real-world mechanics (ripples get smaller and faster when the motor accelerates). Crucially, it also outputs a Confidence Score. If the PINN's signal equation breaks down during a massive transient spike, the Confidence drops, giving the system a metric to pause counting.</w:t>
       </w:r>
     </w:p>
     <w:p>
@@ -226,12 +194,12 @@
         <w:pStyle w:val="Heading1"/>
       </w:pPr>
       <w:r>
-        <w:t>4. Final Ripple Counting (Shared by Both)</w:t>
+        <w:t>4. Final Ripple Counting (Shared)</w:t>
       </w:r>
     </w:p>
     <w:p>
       <w:r>
-        <w:t>Regardless of which model is chosen to do the untangling, the final step is incredibly simple. We discard the baseline outputs entirely, and run a standard peak-detection algorithm on the isolated Ripple output. Because the signal has been perfectly separated from the startup surges and centered around zero, every peak is a guaranteed commutator crossing.</w:t>
+        <w:t>Regardless of which mathematical constraint (Electrical ODE vs Signal Structure) the PINN uses to do the untangling, the final step is the same. We discard the baseline output entirely, and run a standard peak-detection algorithm on the isolated Ripple output.</w:t>
       </w:r>
     </w:p>
     <w:p>

</xml_diff>

<commit_message>
Merge ablation study (Vanilla/Hybrid/Fourier) with the two mathematical constraints into a single comprehensive Layman proposal
</commit_message>
<xml_diff>
--- a/PINN_Approach_Layman.docx
+++ b/PINN_Approach_Layman.docx
@@ -8,7 +8,7 @@
         <w:jc w:val="center"/>
       </w:pPr>
       <w:r>
-        <w:t>Architecture Proposals: Hybrid Fourier Inverse PINN Approaches</w:t>
+        <w:t>Architecture Proposals: Deep Learning for Ripple Counting</w:t>
       </w:r>
     </w:p>
     <w:p>
@@ -16,15 +16,19 @@
         <w:pStyle w:val="Heading1"/>
       </w:pPr>
       <w:r>
-        <w:t>1. The Core Architecture (Shared by both models)</w:t>
+        <w:t>1. The Core Problem</w:t>
       </w:r>
     </w:p>
     <w:p>
       <w:r>
-        <w:t>For this project, we are strictly utilizing a Hybrid Fourier Inverse Physics-Informed Neural Network (PINN). Unlike standard AI that looks at a window of data to guess a trend, our PINN operates Point-by-Point. It takes a specific microsecond in Time (t) and uses strict mathematical constraints to physically untangle the massive motor startup surge (the Baseline) from the tiny commutation waves (the Ripples).</w:t>
+        <w:t>When a motor runs, the electrical current it uses isn't perfectly smooth. It has two main parts mixed together:</w:t>
+        <w:br/>
+        <w:t>1. The Baseline: The massive amount of power the motor needs just to spin (this spikes heavily when you first turn the motor on or hit the brakes).</w:t>
+        <w:br/>
+        <w:t>2. The Ripples: Tiny, repetitive waves that happen every time the motor's internal brushes hit a new copper pad. By counting these tiny waves, we know exactly how far the motor has turned.</w:t>
         <w:br/>
         <w:br/>
-        <w:t>While both models use the exact same Neural Network architecture (Dual-Head, Fourier features on the ripple head), they differ in the mathematical equation they use as their 'Loss Function' constraint to force the untangling.</w:t>
+        <w:t>The problem? When the motor starts up, the massive "Baseline" power completely buries the tiny "Ripples." We need a deep learning architecture designed to mathematically untangle the signal so we can count the ripples cleanly, without needing human-labeled training data.</w:t>
       </w:r>
     </w:p>
     <w:p>
@@ -68,20 +72,90 @@
         <w:pStyle w:val="Heading1"/>
       </w:pPr>
       <w:r>
-        <w:t>2. Proposal A: The Electrical ODE PINN</w:t>
+        <w:t>2. Why specifically a 'Hybrid Fourier' PINN?</w:t>
       </w:r>
     </w:p>
     <w:p>
       <w:r>
+        <w:t>Before finalizing the architecture, we systematically evaluated three other Physics-Informed Neural Network (PINN) configurations. Here is exactly why each one failed, and why the Hybrid Fourier PINN is the only viable choice:</w:t>
+        <w:br/>
+        <w:br/>
+      </w:r>
+      <w:r>
         <w:rPr>
           <w:b/>
         </w:rPr>
-        <w:t xml:space="preserve">Model: </w:t>
+        <w:t>Model 1: Vanilla PINN (Single Head, No Fourier Features)</w:t>
+        <w:br/>
       </w:r>
       <w:r>
-        <w:t>Hybrid Fourier Inverse PINN</w:t>
+        <w:t>- How it works: A standard PINN with a single output (Total Current).</w:t>
+        <w:br/>
+        <w:t>- Why it fails (Spectral Bias): Standard Neural Networks fundamentally struggle to learn high-frequency oscillations. A Vanilla PINN will perfectly learn the massive, smooth startup curve of the motor, but it will completely blur out and ignore the tiny, fast commutation ripples. You cannot extract counts from a completely blurred line.</w:t>
+        <w:br/>
         <w:br/>
       </w:r>
+      <w:r>
+        <w:rPr>
+          <w:b/>
+        </w:rPr>
+        <w:t>Model 2: Hybrid PINN (Dual-Head, No Fourier Features)</w:t>
+        <w:br/>
+      </w:r>
+      <w:r>
+        <w:t>- How it works: A network split into two outputs (Baseline and Ripple) to try and untangle the signal, but using standard Neural Network layers for both heads.</w:t>
+        <w:br/>
+        <w:t>- Why it fails: Even with two dedicated outputs, standard Neural Networks still suffer from Spectral Bias. Output 1 will successfully learn the Baseline envelope, but Output 2 will fail to capture the fast ripples. Instead, Output 2 will either output flat noise or struggle to converge.</w:t>
+        <w:br/>
+        <w:br/>
+      </w:r>
+      <w:r>
+        <w:rPr>
+          <w:b/>
+        </w:rPr>
+        <w:t>Model 3: Fourier PINN (Single Head, With Fourier Features)</w:t>
+        <w:br/>
+      </w:r>
+      <w:r>
+        <w:t>- How it works: A single-output PINN where we apply Fourier Feature Embedding (sines and cosines) to the entire network to fix the spectral bias.</w:t>
+        <w:br/>
+        <w:t>- Why it fails (Physics Corruption): If you give the *entire* network high-frequency Fourier math, the network tries to learn *everything* as a high-frequency wiggle. It will artificially inject ripples into the smooth baseline (overfitting the noise), which completely violates the fundamental physics of the inductor.</w:t>
+        <w:br/>
+        <w:br/>
+      </w:r>
+      <w:r>
+        <w:rPr>
+          <w:b/>
+        </w:rPr>
+        <w:t>The Solution: Hybrid Fourier PINN</w:t>
+        <w:br/>
+      </w:r>
+      <w:r>
+        <w:t>We use a Dual-Head structure (Hybrid) to separate the baseline from the ripples, but we apply Fourier Feature Embedding ONLY to the Ripple Head. This allows the Baseline Head to cleanly obey the slow motor physics, while giving the Ripple Head the exact mathematical tools it needs to capture the high-frequency commutation ripples without corrupting the baseline.</w:t>
+      </w:r>
+    </w:p>
+    <w:p>
+      <w:pPr>
+        <w:pStyle w:val="Heading1"/>
+      </w:pPr>
+      <w:r>
+        <w:t>3. Two Mathematical Approaches for the Hybrid Fourier PINN</w:t>
+      </w:r>
+    </w:p>
+    <w:p>
+      <w:r>
+        <w:t>Having established that the Neural Network architecture must be a Hybrid Fourier PINN, we present two competing proposals for the 'Loss Function'. This is the mathematical constraint used to grade the AI during training and force it to untangle the signals.</w:t>
+      </w:r>
+    </w:p>
+    <w:p>
+      <w:pPr>
+        <w:pStyle w:val="Heading2"/>
+      </w:pPr>
+      <w:r>
+        <w:t>Proposal A: The Electrical ODE PINN</w:t>
+      </w:r>
+    </w:p>
+    <w:p>
       <w:r>
         <w:rPr>
           <w:b/>
@@ -123,15 +197,15 @@
         <w:br/>
       </w:r>
       <w:r>
-        <w:t>We use Voltage because it is the electrical 'Cause', forcing the AI to calculate the Current 'Effect' from scratch without cheating. We use an Inverse PINN because the motor parameters (R, L, E) are unknown; the network discovers them dynamically during training.</w:t>
+        <w:t>We use Voltage because it is the electrical 'Cause', forcing the AI to calculate the Current 'Effect' from scratch without cheating. Because the motor parameters (R, L, E) are unknown, the network is formulated as an Inverse PINN, dynamically discovering them during training.</w:t>
       </w:r>
     </w:p>
     <w:p>
       <w:pPr>
-        <w:pStyle w:val="Heading1"/>
+        <w:pStyle w:val="Heading2"/>
       </w:pPr>
       <w:r>
-        <w:t>3. Proposal B: The Signal-Constrained PINN</w:t>
+        <w:t>Proposal B: The Signal-Constrained PINN</w:t>
       </w:r>
     </w:p>
     <w:p>
@@ -139,20 +213,10 @@
         <w:rPr>
           <w:b/>
         </w:rPr>
-        <w:t xml:space="preserve">Model: </w:t>
-      </w:r>
-      <w:r>
-        <w:t>Hybrid Fourier Inverse PINN</w:t>
-        <w:br/>
-      </w:r>
-      <w:r>
-        <w:rPr>
-          <w:b/>
-        </w:rPr>
         <w:t xml:space="preserve">Inputs: </w:t>
       </w:r>
       <w:r>
-        <w:t>Time (t), Voltage (V), optionally Speed/PWM</w:t>
+        <w:t>Time (t), Voltage (V)</w:t>
         <w:br/>
       </w:r>
       <w:r>
@@ -174,7 +238,7 @@
         <w:br/>
       </w:r>
       <w:r>
-        <w:t>Instead of the electrical circuit ODE, this model uses a structural signal equation: i(t) = b(t) + A(t)*q(t) + noise. It still uses the Dual-Head Fourier PINN architecture, but it constrains the second head to explicitly model Amplitude Modulation (A) and Phase (q). The baseline b(t) is still constrained to be smooth, but the ripple head is now mathematically forced to output a structured, periodic wave whose size (Amplitude) and speed (Frequency) change over time based on the motor load.</w:t>
+        <w:t>Instead of the electrical circuit ODE, this model uses a structural signal equation: i(t) = b(t) + A(t)*q(t) + noise. It still uses the Dual-Head Fourier architecture, but it constrains the second head to explicitly model Amplitude Modulation (A) and Phase (q). The baseline b(t) is still constrained to be smooth, but the ripple head is mathematically forced to output a structured, periodic wave whose size (Amplitude) and speed (Frequency) change over time based on the motor load.</w:t>
         <w:br/>
         <w:br/>
       </w:r>

</xml_diff>

<commit_message>
Rewrite math constraint explanations for Layman audience, including explicit assumptions and how the AI combats them
</commit_message>
<xml_diff>
--- a/PINN_Approach_Layman.docx
+++ b/PINN_Approach_Layman.docx
@@ -160,20 +160,13 @@
         <w:rPr>
           <w:b/>
         </w:rPr>
-        <w:t xml:space="preserve">Inputs: </w:t>
-      </w:r>
-      <w:r>
-        <w:t>Time (t), Voltage (V)</w:t>
+        <w:t>The Math Concept (Explained simply):</w:t>
         <w:br/>
       </w:r>
       <w:r>
-        <w:rPr>
-          <w:b/>
-        </w:rPr>
-        <w:t xml:space="preserve">Outputs: </w:t>
-      </w:r>
-      <w:r>
-        <w:t>Baseline Current b(t), Ripple Current r(t)</w:t>
+        <w:t>This model forces the baseline output to obey the electrical equation of the motor: V = L(di/dt) + Ri + E.</w:t>
+        <w:br/>
+        <w:t>Think of the motor like a heavy water pipe. Voltage (V) is the water pressure pushing in. Current (i) is the water flowing. Inductance (L) is the sheer weight and momentum of the water resisting sudden changes in flow. Because the 'water' is so heavy, the flow cannot suddenly jerk up and down 20 times a second. By mathematically forcing the AI to obey this 'heavy water pipe' rule, it is physically impossible for the AI to draw the fast, jerky ripples into the baseline output. To make its final answer match the real sensor data, the PINN is forced to dump all the fast, jerky ripples into its second output.</w:t>
         <w:br/>
         <w:br/>
       </w:r>
@@ -181,11 +174,13 @@
         <w:rPr>
           <w:b/>
         </w:rPr>
-        <w:t>The Mathematical Constraint:</w:t>
+        <w:t>Assumptions &amp; Limitations:</w:t>
         <w:br/>
       </w:r>
       <w:r>
-        <w:t>This model forces the baseline output to obey the fundamental electrical equation of the motor: V = L(di/dt) + Ri + E. Because this physics equation governs massive inductors, it is mathematically incapable of drawing tiny, fast ripples. To make its final answer match the real sensor data, the PINN is forced to dump all the unexplained ripples into its second output.</w:t>
+        <w:t>1. It assumes the motor is a standard Brushed DC motor. It will not work on AC Induction motors.</w:t>
+        <w:br/>
+        <w:t>2. It assumes Resistance (R) and Inductance (L) are perfectly constant. In reality, a motor heats up (changing R) and magnets saturate (changing L).</w:t>
         <w:br/>
         <w:br/>
       </w:r>
@@ -193,11 +188,11 @@
         <w:rPr>
           <w:b/>
         </w:rPr>
-        <w:t>Input/Output Justification:</w:t>
+        <w:t>How we combat these limitations:</w:t>
         <w:br/>
       </w:r>
       <w:r>
-        <w:t>We use Voltage because it is the electrical 'Cause', forcing the AI to calculate the Current 'Effect' from scratch without cheating. Because the motor parameters (R, L, E) are unknown, the network is formulated as an Inverse PINN, dynamically discovering them during training.</w:t>
+        <w:t>We don't actually care that the equation is slightly wrong! We *want* this simple, smooth equation because it forces the AI to draw the macroscopic baseline. Because the AI is forced to use a simplified equation for the Baseline Head, it simply dumps all the complex real-world mess (including the ripples and the changing temperatures) into the Fourier Head. The limitation is actually the very mechanism that separates the signals.</w:t>
       </w:r>
     </w:p>
     <w:p>
@@ -213,20 +208,13 @@
         <w:rPr>
           <w:b/>
         </w:rPr>
-        <w:t xml:space="preserve">Inputs: </w:t>
-      </w:r>
-      <w:r>
-        <w:t>Time (t), Voltage (V)</w:t>
+        <w:t>The Math Concept (Explained simply):</w:t>
         <w:br/>
       </w:r>
       <w:r>
-        <w:rPr>
-          <w:b/>
-        </w:rPr>
-        <w:t xml:space="preserve">Outputs: </w:t>
-      </w:r>
-      <w:r>
-        <w:t>Baseline b(t), Ripple Phase q(t), Amplitude A(t), Instantaneous Freq, Confidence</w:t>
+        <w:t>Instead of using electricity, this model uses a structural shape equation: i(t) = b(t) + A(t)*q(t) + noise.</w:t>
+        <w:br/>
+        <w:t>It ignores the motor's internal circuitry entirely. It simply states: 'Any motor current graph is just a smooth line (b) combined with a squiggly repeating wave (q) that gets taller or shorter (A) depending on how hard the motor is working.' The baseline is mathematically constrained to be smooth, but the ripple head is explicitly forced to output a structured, repeating wave.</w:t>
         <w:br/>
         <w:br/>
       </w:r>
@@ -234,11 +222,13 @@
         <w:rPr>
           <w:b/>
         </w:rPr>
-        <w:t>The Mathematical Constraint:</w:t>
+        <w:t>Assumptions &amp; Limitations:</w:t>
         <w:br/>
       </w:r>
       <w:r>
-        <w:t>Instead of the electrical circuit ODE, this model uses a structural signal equation: i(t) = b(t) + A(t)*q(t) + noise. It still uses the Dual-Head Fourier architecture, but it constrains the second head to explicitly model Amplitude Modulation (A) and Phase (q). The baseline b(t) is still constrained to be smooth, but the ripple head is mathematically forced to output a structured, periodic wave whose size (Amplitude) and speed (Frequency) change over time based on the motor load.</w:t>
+        <w:t>1. It assumes that ripples are perfectly repeating (periodic) and sit cleanly on top of the baseline.</w:t>
+        <w:br/>
+        <w:t>2. In reality, ripples 'stretch and squash' like an accordion as the motor speeds up and slows down, meaning the frequency is constantly changing.</w:t>
         <w:br/>
         <w:br/>
       </w:r>
@@ -246,11 +236,11 @@
         <w:rPr>
           <w:b/>
         </w:rPr>
-        <w:t>Input/Output Justification:</w:t>
+        <w:t>How we combat these limitations:</w:t>
         <w:br/>
       </w:r>
       <w:r>
-        <w:t>By explicitly outputting Amplitude and Instantaneous Frequency, this PINN accounts for real-world mechanics (ripples get smaller and faster when the motor accelerates). Crucially, it also outputs a Confidence Score. If the PINN's signal equation breaks down during a massive transient spike, the Confidence drops, giving the system a metric to pause counting.</w:t>
+        <w:t>We explicitly force the AI to calculate the 'Instantaneous Frequency' (how fast the squiggles are happening at that exact millisecond) rather than assuming a fixed speed. Crucially, it also outputs a Confidence Score. If the AI detects a massive, unexpected spike that doesn't fit the 'squiggly wave' shape, the Confidence drops, giving the system a metric to pause counting.</w:t>
       </w:r>
     </w:p>
     <w:p>

</xml_diff>

<commit_message>
Restore I/O lists and explicitly explain how the Inverse PINN discovers R and L automatically
</commit_message>
<xml_diff>
--- a/PINN_Approach_Layman.docx
+++ b/PINN_Approach_Layman.docx
@@ -160,6 +160,29 @@
         <w:rPr>
           <w:b/>
         </w:rPr>
+        <w:t xml:space="preserve">Inputs: </w:t>
+      </w:r>
+      <w:r>
+        <w:t>Time (t), Voltage (V) [Point-by-Point]</w:t>
+        <w:br/>
+      </w:r>
+      <w:r>
+        <w:rPr>
+          <w:b/>
+        </w:rPr>
+        <w:t xml:space="preserve">Outputs: </w:t>
+      </w:r>
+      <w:r>
+        <w:t>Baseline Current b(t), Ripple Current r(t)</w:t>
+        <w:br/>
+        <w:br/>
+      </w:r>
+    </w:p>
+    <w:p>
+      <w:r>
+        <w:rPr>
+          <w:b/>
+        </w:rPr>
         <w:t>The Math Concept (Explained simply):</w:t>
         <w:br/>
       </w:r>
@@ -180,7 +203,9 @@
       <w:r>
         <w:t>1. It assumes the motor is a standard Brushed DC motor. It will not work on AC Induction motors.</w:t>
         <w:br/>
-        <w:t>2. It assumes Resistance (R) and Inductance (L) are perfectly constant. In reality, a motor heats up (changing R) and magnets saturate (changing L).</w:t>
+        <w:t>2. It relies on the motor's Resistance (R), Inductance (L), and Back-EMF (E), which we don't naturally know.</w:t>
+        <w:br/>
+        <w:t>3. It assumes R and L are perfectly constant. In reality, a motor heats up (changing R) and magnets saturate (changing L).</w:t>
         <w:br/>
         <w:br/>
       </w:r>
@@ -188,11 +213,13 @@
         <w:rPr>
           <w:b/>
         </w:rPr>
-        <w:t>How we combat these limitations:</w:t>
+        <w:t>How we combat these limitations (Inverse Parameter Discovery):</w:t>
         <w:br/>
       </w:r>
       <w:r>
-        <w:t>We don't actually care that the equation is slightly wrong! We *want* this simple, smooth equation because it forces the AI to draw the macroscopic baseline. Because the AI is forced to use a simplified equation for the Baseline Head, it simply dumps all the complex real-world mess (including the ripples and the changing temperatures) into the Fourier Head. The limitation is actually the very mechanism that separates the signals.</w:t>
+        <w:t xml:space="preserve">To get R, L, and E, we use an 'Inverse PINN' strategy. We don't manually measure or hardcode them; instead, the AI discovers them dynamically. It tests thousands of combinations of R and L in the background until the physics perfectly match your Excel data. </w:t>
+        <w:br/>
+        <w:t>As for the assumption that they are perfectly constant? We don't actually care that the equation is slightly wrong! We *want* this simple, smooth equation because it forces the AI to draw the macroscopic baseline. Because the AI is forced to use a simplified equation for the Baseline Head, it simply dumps all the complex real-world mess (including the ripples and the changing temperatures) into the Fourier Head. The limitation is actually the very mechanism that separates the signals.</w:t>
       </w:r>
     </w:p>
     <w:p>
@@ -201,6 +228,29 @@
       </w:pPr>
       <w:r>
         <w:t>Proposal B: The Signal-Constrained PINN</w:t>
+      </w:r>
+    </w:p>
+    <w:p>
+      <w:r>
+        <w:rPr>
+          <w:b/>
+        </w:rPr>
+        <w:t xml:space="preserve">Inputs: </w:t>
+      </w:r>
+      <w:r>
+        <w:t>Time (t), Voltage (V) [Point-by-Point]</w:t>
+        <w:br/>
+      </w:r>
+      <w:r>
+        <w:rPr>
+          <w:b/>
+        </w:rPr>
+        <w:t xml:space="preserve">Outputs: </w:t>
+      </w:r>
+      <w:r>
+        <w:t>Baseline b(t), Ripple Phase q(t), Amplitude A(t), Instantaneous Freq, Confidence</w:t>
+        <w:br/>
+        <w:br/>
       </w:r>
     </w:p>
     <w:p>

</xml_diff>

<commit_message>
Update Proposal B inputs to explicitly include Measured Current (I), and add a dedicated section explaining how calculated Speed and PWM massively improve both proposals
</commit_message>
<xml_diff>
--- a/PINN_Approach_Layman.docx
+++ b/PINN_Approach_Layman.docx
@@ -139,7 +139,25 @@
         <w:pStyle w:val="Heading1"/>
       </w:pPr>
       <w:r>
-        <w:t>3. Two Mathematical Approaches for the Hybrid Fourier PINN</w:t>
+        <w:t>3. The Secret Weapon: Auxiliary Inputs (Speed &amp; PWM)</w:t>
+      </w:r>
+    </w:p>
+    <w:p>
+      <w:r>
+        <w:t>Before diving into the mathematical constraints, it is critical to note that we have access to calculated Speed and PWM quantities. While not strictly required, passing these as additional inputs to the neural network provides massive performance boosts for both proposals:</w:t>
+        <w:br/>
+        <w:br/>
+        <w:t>1. Speed: The ripple frequency is directly physically linked to the motor's speed. By passing the calculated speed into the network, it instantly knows exactly what frequency of squiggles to hunt for, completely eliminating false positives.</w:t>
+        <w:br/>
+        <w:t>2. PWM (Voltage Duty Cycle): PWM helps the network understand exactly how much energy is being injected at any given microsecond, making its physics calculations vastly more accurate.</w:t>
+      </w:r>
+    </w:p>
+    <w:p>
+      <w:pPr>
+        <w:pStyle w:val="Heading1"/>
+      </w:pPr>
+      <w:r>
+        <w:t>4. Two Mathematical Approaches for the Hybrid Fourier PINN</w:t>
       </w:r>
     </w:p>
     <w:p>
@@ -163,7 +181,7 @@
         <w:t xml:space="preserve">Inputs: </w:t>
       </w:r>
       <w:r>
-        <w:t>Time (t), Voltage (V) [Point-by-Point]</w:t>
+        <w:t>Time (t), Voltage (V) [Point-by-Point] (plus optional Speed/PWM)</w:t>
         <w:br/>
       </w:r>
       <w:r>
@@ -217,7 +235,7 @@
         <w:br/>
       </w:r>
       <w:r>
-        <w:t xml:space="preserve">To get R, L, and E, we use an 'Inverse PINN' strategy. We don't manually measure or hardcode them; instead, the AI discovers them dynamically. It tests thousands of combinations of R and L in the background until the physics perfectly match your Excel data. </w:t>
+        <w:t xml:space="preserve">To get R, L, and E, we use an 'Inverse PINN' strategy. We don't manually measure or hardcode them; instead, the AI discovers them dynamically. It tests thousands of combinations of R and L in the background until the physics perfectly match your Excel data. (Passing calculated Speed helps immensely here, since Back-EMF 'E' is proportional to speed!). </w:t>
         <w:br/>
         <w:t>As for the assumption that they are perfectly constant? We don't actually care that the equation is slightly wrong! We *want* this simple, smooth equation because it forces the AI to draw the macroscopic baseline. Because the AI is forced to use a simplified equation for the Baseline Head, it simply dumps all the complex real-world mess (including the ripples and the changing temperatures) into the Fourier Head. The limitation is actually the very mechanism that separates the signals.</w:t>
       </w:r>
@@ -227,7 +245,7 @@
         <w:pStyle w:val="Heading2"/>
       </w:pPr>
       <w:r>
-        <w:t>Proposal B: The Signal-Constrained PINN</w:t>
+        <w:t>Proposal B: The Signal-Constrained Model</w:t>
       </w:r>
     </w:p>
     <w:p>
@@ -238,7 +256,7 @@
         <w:t xml:space="preserve">Inputs: </w:t>
       </w:r>
       <w:r>
-        <w:t>Time (t), Voltage (V) [Point-by-Point]</w:t>
+        <w:t>Measured Current I(t), Voltage V(t) (plus optional Speed/PWM)</w:t>
         <w:br/>
       </w:r>
       <w:r>
@@ -262,7 +280,7 @@
         <w:br/>
       </w:r>
       <w:r>
-        <w:t>Instead of using electricity, this model uses a structural shape equation: i(t) = b(t) + A(t)*q(t) + noise.</w:t>
+        <w:t>Instead of using electricity to reconstruct the current from scratch, this model looks directly at the measured Current (I) and uses a structural shape equation: i(t) = b(t) + A(t)*q(t) + noise.</w:t>
         <w:br/>
         <w:t>It ignores the motor's internal circuitry entirely. It simply states: 'Any motor current graph is just a smooth line (b) combined with a squiggly repeating wave (q) that gets taller or shorter (A) depending on how hard the motor is working.' The baseline is mathematically constrained to be smooth, but the ripple head is explicitly forced to output a structured, repeating wave.</w:t>
         <w:br/>
@@ -290,7 +308,7 @@
         <w:br/>
       </w:r>
       <w:r>
-        <w:t>We explicitly force the AI to calculate the 'Instantaneous Frequency' (how fast the squiggles are happening at that exact millisecond) rather than assuming a fixed speed. Crucially, it also outputs a Confidence Score. If the AI detects a massive, unexpected spike that doesn't fit the 'squiggly wave' shape, the Confidence drops, giving the system a metric to pause counting.</w:t>
+        <w:t>We explicitly force the AI to calculate the 'Instantaneous Frequency' (how fast the squiggles are happening at that exact millisecond) rather than assuming a fixed speed. (Again, passing the calculated Speed input directly to the network provides an incredibly powerful anchor for the network to find the true frequency). Crucially, it also outputs a Confidence Score. If the AI detects a massive, unexpected spike that doesn't fit the 'squiggly wave' shape, the Confidence drops, giving the system a metric to pause counting.</w:t>
       </w:r>
     </w:p>
     <w:p>
@@ -298,12 +316,12 @@
         <w:pStyle w:val="Heading1"/>
       </w:pPr>
       <w:r>
-        <w:t>4. Final Ripple Counting (Shared)</w:t>
+        <w:t>5. Final Ripple Counting (Shared)</w:t>
       </w:r>
     </w:p>
     <w:p>
       <w:r>
-        <w:t>Regardless of which mathematical constraint (Electrical ODE vs Signal Structure) the PINN uses to do the untangling, the final step is the same. We discard the baseline output entirely, and run a standard peak-detection algorithm on the isolated Ripple output.</w:t>
+        <w:t>Regardless of which mathematical constraint (Electrical ODE vs Signal Structure) the model uses to do the untangling, the final step is the same. We discard the baseline output entirely, and run a standard peak-detection algorithm on the isolated Ripple output.</w:t>
       </w:r>
     </w:p>
     <w:p>

</xml_diff>

<commit_message>
Add final recommendation section explicitly choosing Proposal B (Signal-Constrained) as the superior industrial solution
</commit_message>
<xml_diff>
--- a/PINN_Approach_Layman.docx
+++ b/PINN_Approach_Layman.docx
@@ -360,6 +360,63 @@
         </w:drawing>
       </w:r>
     </w:p>
+    <w:p>
+      <w:pPr>
+        <w:pStyle w:val="Heading1"/>
+      </w:pPr>
+      <w:r>
+        <w:t>6. Final Recommendation: Which is Better?</w:t>
+      </w:r>
+    </w:p>
+    <w:p>
+      <w:r>
+        <w:rPr>
+          <w:b/>
+        </w:rPr>
+        <w:t>The Final Decision: Proposal B (The Signal-Constrained Model)</w:t>
+        <w:br/>
+        <w:br/>
+      </w:r>
+      <w:r>
+        <w:t>While Proposal A (Electrical ODE) is an incredibly elegant physics solution, Proposal B is the strictly superior choice for this specific industrial application. Here is why:</w:t>
+        <w:br/>
+        <w:br/>
+      </w:r>
+      <w:r>
+        <w:rPr>
+          <w:b/>
+        </w:rPr>
+        <w:t>1. The Goal is Counting, Not Physics Simulation:</w:t>
+        <w:br/>
+      </w:r>
+      <w:r>
+        <w:t>Our goal is not to perfectly model the thermodynamics and resistance changes of the motor; our goal is strictly to count ripples robustly. By shifting from an electrical circuit equation to a structural signal equation, we turn a rigid physics problem into a highly flexible signal-processing problem.</w:t>
+        <w:br/>
+        <w:br/>
+      </w:r>
+      <w:r>
+        <w:rPr>
+          <w:b/>
+        </w:rPr>
+        <w:t>2. Real-World Amplitude Modulation:</w:t>
+        <w:br/>
+      </w:r>
+      <w:r>
+        <w:t>In the real world, as a motor encounters heavy physical load, the commutation ripples get taller (higher amplitude). Proposal B natively expects and models this via the Amplitude A(t) output, meaning the AI won't accidentally confuse a massive ripple for a baseline surge.</w:t>
+        <w:br/>
+        <w:br/>
+      </w:r>
+      <w:r>
+        <w:rPr>
+          <w:b/>
+        </w:rPr>
+        <w:t>3. The Confidence Metric (The Ultimate Decider):</w:t>
+        <w:br/>
+      </w:r>
+      <w:r>
+        <w:t>The number one reason ripple counters fail in the field is false positives caused by random transient spikes (e.g., someone bumping the motor or a sudden voltage drop). Because Proposal B outputs a strict Confidence Score, the system knows exactly when the signal has become too messy to trust. If the confidence drops, the software can temporarily pause counting and rely on the calculated speed to estimate position until the signal clears up. This single feature elevates Proposal B from a lab experiment to an industrial-grade solution.</w:t>
+      </w:r>
+    </w:p>
     <w:sectPr>
       <w:pgSz w:w="12240" w:h="15840"/>
       <w:pgMar w:top="1440" w:right="1800" w:bottom="1440" w:left="1800" w:header="720" w:footer="720" w:gutter="0"/>

</xml_diff>